<commit_message>
TS 4 Nachu correction
</commit_message>
<xml_diff>
--- a/saMhitA/04/TS 4 Tamil Corrections.docx
+++ b/saMhitA/04/TS 4 Tamil Corrections.docx
@@ -10,7 +10,6 @@
           <w:bCs/>
         </w:rPr>
       </w:pPr>
-      <w:proofErr w:type="spellStart"/>
       <w:r>
         <w:rPr>
           <w:b/>
@@ -19,29 +18,7 @@
           <w:szCs w:val="32"/>
           <w:u w:val="single"/>
         </w:rPr>
-        <w:t>TaittirIya</w:t>
-      </w:r>
-      <w:proofErr w:type="spellEnd"/>
-      <w:r>
-        <w:rPr>
-          <w:b/>
-          <w:bCs/>
-          <w:sz w:val="32"/>
-          <w:szCs w:val="32"/>
-          <w:u w:val="single"/>
-        </w:rPr>
-        <w:t xml:space="preserve"> </w:t>
-      </w:r>
-      <w:proofErr w:type="spellStart"/>
-      <w:r>
-        <w:rPr>
-          <w:b/>
-          <w:bCs/>
-          <w:sz w:val="32"/>
-          <w:szCs w:val="32"/>
-          <w:u w:val="single"/>
-        </w:rPr>
-        <w:t>Samhit</w:t>
+        <w:t>TaittirIya Samhit</w:t>
       </w:r>
       <w:r>
         <w:rPr>
@@ -53,7 +30,705 @@
         </w:rPr>
         <w:t>A</w:t>
       </w:r>
-      <w:proofErr w:type="spellEnd"/>
+      <w:r>
+        <w:rPr>
+          <w:b/>
+          <w:bCs/>
+          <w:sz w:val="32"/>
+          <w:szCs w:val="32"/>
+          <w:u w:val="single"/>
+        </w:rPr>
+        <w:t xml:space="preserve"> –</w:t>
+      </w:r>
+      <w:r>
+        <w:rPr>
+          <w:b/>
+          <w:bCs/>
+          <w:sz w:val="32"/>
+          <w:szCs w:val="32"/>
+          <w:u w:val="single"/>
+        </w:rPr>
+        <w:t xml:space="preserve"> TS 4 Tamil </w:t>
+      </w:r>
+      <w:r>
+        <w:rPr>
+          <w:b/>
+          <w:bCs/>
+          <w:sz w:val="32"/>
+          <w:szCs w:val="32"/>
+          <w:u w:val="single"/>
+        </w:rPr>
+        <w:t>Corrections –</w:t>
+      </w:r>
+      <w:r>
+        <w:rPr>
+          <w:b/>
+          <w:bCs/>
+          <w:sz w:val="32"/>
+          <w:szCs w:val="32"/>
+          <w:u w:val="single"/>
+        </w:rPr>
+        <w:t xml:space="preserve"> </w:t>
+      </w:r>
+      <w:r>
+        <w:rPr>
+          <w:b/>
+          <w:bCs/>
+          <w:sz w:val="32"/>
+          <w:szCs w:val="32"/>
+          <w:u w:val="single"/>
+        </w:rPr>
+        <w:t xml:space="preserve">Observed till </w:t>
+      </w:r>
+      <w:r>
+        <w:rPr>
+          <w:b/>
+          <w:bCs/>
+          <w:color w:val="EE0000"/>
+        </w:rPr>
+        <w:t xml:space="preserve"> </w:t>
+      </w:r>
+      <w:r>
+        <w:rPr>
+          <w:b/>
+          <w:bCs/>
+        </w:rPr>
+        <w:br/>
+        <w:t>(ignore those which are already incorporated in your book’s version and date)</w:t>
+      </w:r>
+    </w:p>
+    <w:tbl>
+      <w:tblPr>
+        <w:tblW w:w="14743" w:type="dxa"/>
+        <w:tblInd w:w="-856" w:type="dxa"/>
+        <w:tblBorders>
+          <w:top w:val="single" w:sz="4" w:space="0" w:color="000000"/>
+          <w:left w:val="single" w:sz="4" w:space="0" w:color="000000"/>
+          <w:bottom w:val="single" w:sz="4" w:space="0" w:color="000000"/>
+          <w:right w:val="single" w:sz="4" w:space="0" w:color="000000"/>
+          <w:insideH w:val="single" w:sz="4" w:space="0" w:color="000000"/>
+          <w:insideV w:val="single" w:sz="4" w:space="0" w:color="000000"/>
+        </w:tblBorders>
+        <w:tblLook w:val="04A0" w:firstRow="1" w:lastRow="0" w:firstColumn="1" w:lastColumn="0" w:noHBand="0" w:noVBand="1"/>
+      </w:tblPr>
+      <w:tblGrid>
+        <w:gridCol w:w="3516"/>
+        <w:gridCol w:w="5415"/>
+        <w:gridCol w:w="28"/>
+        <w:gridCol w:w="5784"/>
+      </w:tblGrid>
+      <w:tr>
+        <w:tc>
+          <w:tcPr>
+            <w:tcW w:w="3516" w:type="dxa"/>
+          </w:tcPr>
+          <w:p>
+            <w:pPr>
+              <w:spacing w:before="0" w:line="240" w:lineRule="auto"/>
+              <w:jc w:val="center"/>
+              <w:rPr>
+                <w:b/>
+                <w:bCs/>
+                <w:sz w:val="32"/>
+                <w:szCs w:val="32"/>
+              </w:rPr>
+            </w:pPr>
+            <w:r>
+              <w:rPr>
+                <w:b/>
+                <w:bCs/>
+                <w:sz w:val="32"/>
+                <w:szCs w:val="32"/>
+              </w:rPr>
+              <w:t>Section, Paragraph</w:t>
+            </w:r>
+          </w:p>
+          <w:p>
+            <w:pPr>
+              <w:spacing w:before="0" w:line="240" w:lineRule="auto"/>
+              <w:jc w:val="center"/>
+              <w:rPr>
+                <w:b/>
+                <w:bCs/>
+                <w:sz w:val="32"/>
+                <w:szCs w:val="32"/>
+              </w:rPr>
+            </w:pPr>
+            <w:r>
+              <w:rPr>
+                <w:b/>
+                <w:bCs/>
+                <w:sz w:val="32"/>
+                <w:szCs w:val="32"/>
+              </w:rPr>
+              <w:t>Reference</w:t>
+            </w:r>
+          </w:p>
+        </w:tc>
+        <w:tc>
+          <w:tcPr>
+            <w:tcW w:w="5443" w:type="dxa"/>
+            <w:gridSpan w:val="2"/>
+          </w:tcPr>
+          <w:p>
+            <w:pPr>
+              <w:spacing w:before="0" w:line="240" w:lineRule="auto"/>
+              <w:jc w:val="center"/>
+              <w:rPr>
+                <w:b/>
+                <w:bCs/>
+                <w:sz w:val="32"/>
+                <w:szCs w:val="32"/>
+              </w:rPr>
+            </w:pPr>
+            <w:r>
+              <w:rPr>
+                <w:b/>
+                <w:bCs/>
+                <w:sz w:val="32"/>
+                <w:szCs w:val="32"/>
+              </w:rPr>
+              <w:t>As Printed</w:t>
+            </w:r>
+          </w:p>
+        </w:tc>
+        <w:tc>
+          <w:tcPr>
+            <w:tcW w:w="5784" w:type="dxa"/>
+          </w:tcPr>
+          <w:p>
+            <w:pPr>
+              <w:spacing w:before="0" w:line="240" w:lineRule="auto"/>
+              <w:ind w:right="-18"/>
+              <w:jc w:val="center"/>
+              <w:rPr>
+                <w:b/>
+                <w:bCs/>
+                <w:sz w:val="32"/>
+                <w:szCs w:val="32"/>
+              </w:rPr>
+            </w:pPr>
+            <w:r>
+              <w:rPr>
+                <w:b/>
+                <w:bCs/>
+                <w:sz w:val="32"/>
+                <w:szCs w:val="32"/>
+              </w:rPr>
+              <w:t>To be read as or corrected as</w:t>
+            </w:r>
+          </w:p>
+        </w:tc>
+      </w:tr>
+      <w:tr>
+        <w:trPr>
+          <w:trHeight w:val="1106"/>
+        </w:trPr>
+        <w:tc>
+          <w:tcPr>
+            <w:tcW w:w="3516" w:type="dxa"/>
+            <w:tcBorders>
+              <w:top w:val="single" w:sz="4" w:space="0" w:color="000000"/>
+              <w:left w:val="single" w:sz="4" w:space="0" w:color="000000"/>
+              <w:bottom w:val="single" w:sz="4" w:space="0" w:color="000000"/>
+              <w:right w:val="single" w:sz="4" w:space="0" w:color="000000"/>
+            </w:tcBorders>
+          </w:tcPr>
+          <w:p>
+            <w:pPr>
+              <w:spacing w:before="0" w:line="240" w:lineRule="auto"/>
+              <w:rPr>
+                <w:rFonts w:cs="Latha"/>
+                <w:b/>
+                <w:sz w:val="28"/>
+                <w:szCs w:val="28"/>
+                <w:lang w:bidi="ta-IN"/>
+              </w:rPr>
+            </w:pPr>
+            <w:r>
+              <w:rPr>
+                <w:rFonts w:cs="Latha"/>
+                <w:b/>
+                <w:sz w:val="28"/>
+                <w:szCs w:val="28"/>
+                <w:lang w:bidi="ta-IN"/>
+              </w:rPr>
+              <w:t>TS 4.</w:t>
+            </w:r>
+            <w:r>
+              <w:rPr>
+                <w:rFonts w:cs="Latha"/>
+                <w:b/>
+                <w:sz w:val="28"/>
+                <w:szCs w:val="28"/>
+                <w:lang w:bidi="ta-IN"/>
+              </w:rPr>
+              <w:t>3</w:t>
+            </w:r>
+            <w:r>
+              <w:rPr>
+                <w:rFonts w:cs="Latha"/>
+                <w:b/>
+                <w:sz w:val="28"/>
+                <w:szCs w:val="28"/>
+                <w:lang w:bidi="ta-IN"/>
+              </w:rPr>
+              <w:t>.</w:t>
+            </w:r>
+            <w:r>
+              <w:rPr>
+                <w:rFonts w:cs="Latha"/>
+                <w:b/>
+                <w:sz w:val="28"/>
+                <w:szCs w:val="28"/>
+                <w:lang w:bidi="ta-IN"/>
+              </w:rPr>
+              <w:t>7.1</w:t>
+            </w:r>
+            <w:r>
+              <w:rPr>
+                <w:rFonts w:cs="Latha"/>
+                <w:b/>
+                <w:sz w:val="28"/>
+                <w:szCs w:val="28"/>
+                <w:lang w:bidi="ta-IN"/>
+              </w:rPr>
+              <w:t xml:space="preserve"> - Vaakyam </w:t>
+            </w:r>
+          </w:p>
+          <w:p>
+            <w:pPr>
+              <w:spacing w:before="0" w:line="240" w:lineRule="auto"/>
+              <w:rPr>
+                <w:rFonts w:cs="Latha"/>
+                <w:b/>
+                <w:sz w:val="28"/>
+                <w:szCs w:val="28"/>
+                <w:lang w:bidi="ta-IN"/>
+              </w:rPr>
+            </w:pPr>
+            <w:r>
+              <w:rPr>
+                <w:rFonts w:cs="Latha"/>
+                <w:b/>
+                <w:sz w:val="28"/>
+                <w:szCs w:val="28"/>
+                <w:lang w:bidi="ta-IN"/>
+              </w:rPr>
+              <w:t xml:space="preserve">Line </w:t>
+            </w:r>
+            <w:r>
+              <w:rPr>
+                <w:rFonts w:cs="Latha"/>
+                <w:b/>
+                <w:sz w:val="28"/>
+                <w:szCs w:val="28"/>
+                <w:lang w:bidi="ta-IN"/>
+              </w:rPr>
+              <w:t>5</w:t>
+            </w:r>
+          </w:p>
+          <w:p>
+            <w:pPr>
+              <w:spacing w:before="0" w:line="240" w:lineRule="auto"/>
+              <w:rPr>
+                <w:rFonts w:cs="Latha"/>
+                <w:b/>
+                <w:sz w:val="28"/>
+                <w:szCs w:val="28"/>
+                <w:lang w:bidi="ta-IN"/>
+              </w:rPr>
+            </w:pPr>
+            <w:r>
+              <w:rPr>
+                <w:rFonts w:cs="Latha"/>
+                <w:b/>
+                <w:sz w:val="28"/>
+                <w:szCs w:val="28"/>
+                <w:lang w:bidi="ta-IN"/>
+              </w:rPr>
+              <w:t xml:space="preserve">Panchaati No. - </w:t>
+            </w:r>
+            <w:r>
+              <w:rPr>
+                <w:rFonts w:cs="Latha"/>
+                <w:b/>
+                <w:sz w:val="28"/>
+                <w:szCs w:val="28"/>
+                <w:lang w:bidi="ta-IN"/>
+              </w:rPr>
+              <w:t>13</w:t>
+            </w:r>
+          </w:p>
+        </w:tc>
+        <w:tc>
+          <w:tcPr>
+            <w:tcW w:w="5415" w:type="dxa"/>
+            <w:tcBorders>
+              <w:top w:val="single" w:sz="4" w:space="0" w:color="000000"/>
+              <w:left w:val="single" w:sz="4" w:space="0" w:color="000000"/>
+              <w:bottom w:val="single" w:sz="4" w:space="0" w:color="000000"/>
+              <w:right w:val="single" w:sz="4" w:space="0" w:color="000000"/>
+            </w:tcBorders>
+          </w:tcPr>
+          <w:p>
+            <w:pPr>
+              <w:rPr>
+                <w:rFonts w:cs="Latha"/>
+                <w:sz w:val="28"/>
+                <w:szCs w:val="28"/>
+                <w:cs/>
+                <w:lang w:bidi="ta-IN"/>
+              </w:rPr>
+            </w:pPr>
+            <w:r>
+              <w:rPr>
+                <w:rFonts w:cs="Latha"/>
+                <w:sz w:val="28"/>
+                <w:szCs w:val="28"/>
+                <w:cs/>
+                <w:lang w:bidi="ta-IN"/>
+              </w:rPr>
+              <w:t>ஸ</w:t>
+            </w:r>
+            <w:r>
+              <w:rPr>
+                <w:rFonts w:cs="Latha"/>
+                <w:sz w:val="28"/>
+                <w:szCs w:val="28"/>
+                <w:highlight w:val="yellow"/>
+                <w:cs/>
+                <w:lang w:bidi="ta-IN"/>
+              </w:rPr>
+              <w:t>மா</w:t>
+            </w:r>
+            <w:r>
+              <w:rPr>
+                <w:rFonts w:cs="Latha"/>
+                <w:sz w:val="28"/>
+                <w:szCs w:val="28"/>
+                <w:cs/>
+                <w:lang w:bidi="ta-IN"/>
+              </w:rPr>
+              <w:t>ஶ்ச</w:t>
+            </w:r>
+            <w:r>
+              <w:rPr>
+                <w:rFonts w:ascii="Latha" w:hAnsi="Latha" w:cs="Latha"/>
+                <w:b/>
+                <w:bCs/>
+                <w:position w:val="-12"/>
+                <w:sz w:val="28"/>
+                <w:szCs w:val="28"/>
+                <w:cs/>
+                <w:lang w:bidi="ta-IN"/>
+              </w:rPr>
+              <w:t>2</w:t>
+            </w:r>
+            <w:r>
+              <w:rPr>
+                <w:rFonts w:cs="Latha"/>
+                <w:sz w:val="28"/>
+                <w:szCs w:val="28"/>
+                <w:cs/>
+                <w:lang w:bidi="ta-IN"/>
+              </w:rPr>
+              <w:t>ந்தோ</w:t>
+            </w:r>
+            <w:r>
+              <w:rPr>
+                <w:rFonts w:ascii="BRH Tamil Tab Extra" w:hAnsi="BRH Tamil Tab Extra" w:cs="Arial"/>
+                <w:b/>
+                <w:sz w:val="36"/>
+                <w:szCs w:val="28"/>
+              </w:rPr>
+              <w:t>…</w:t>
+            </w:r>
+            <w:r>
+              <w:rPr>
+                <w:rFonts w:ascii="Latha" w:hAnsi="Latha" w:cs="Latha"/>
+                <w:b/>
+                <w:bCs/>
+                <w:position w:val="-12"/>
+                <w:sz w:val="28"/>
+                <w:szCs w:val="28"/>
+                <w:cs/>
+                <w:lang w:bidi="ta-IN"/>
+              </w:rPr>
+              <w:t>3</w:t>
+            </w:r>
+            <w:r>
+              <w:rPr>
+                <w:rFonts w:cs="Arial"/>
+                <w:sz w:val="28"/>
+                <w:szCs w:val="28"/>
+                <w:cs/>
+                <w:lang w:bidi="ta-IN"/>
+              </w:rPr>
+              <w:t xml:space="preserve"> </w:t>
+            </w:r>
+            <w:r>
+              <w:rPr>
+                <w:rFonts w:cs="Latha"/>
+                <w:sz w:val="28"/>
+                <w:szCs w:val="28"/>
+                <w:cs/>
+                <w:lang w:bidi="ta-IN"/>
+              </w:rPr>
+              <w:t>நக்ஷ</w:t>
+            </w:r>
+            <w:r>
+              <w:rPr>
+                <w:rFonts w:ascii="BRH Tamil Tab Extra" w:hAnsi="BRH Tamil Tab Extra" w:cs="Arial"/>
+                <w:b/>
+                <w:sz w:val="36"/>
+                <w:szCs w:val="28"/>
+              </w:rPr>
+              <w:t>†</w:t>
+            </w:r>
+            <w:r>
+              <w:rPr>
+                <w:rFonts w:cs="Latha"/>
+                <w:sz w:val="28"/>
+                <w:szCs w:val="28"/>
+                <w:cs/>
+                <w:lang w:bidi="ta-IN"/>
+              </w:rPr>
+              <w:t>த்ராணி</w:t>
+            </w:r>
+            <w:r>
+              <w:rPr>
+                <w:rFonts w:ascii="BRH Tamil Tab Extra" w:hAnsi="BRH Tamil Tab Extra" w:cs="Arial"/>
+                <w:b/>
+                <w:sz w:val="36"/>
+                <w:szCs w:val="28"/>
+              </w:rPr>
+              <w:t>…</w:t>
+            </w:r>
+          </w:p>
+        </w:tc>
+        <w:tc>
+          <w:tcPr>
+            <w:tcW w:w="5812" w:type="dxa"/>
+            <w:gridSpan w:val="2"/>
+            <w:tcBorders>
+              <w:top w:val="single" w:sz="4" w:space="0" w:color="000000"/>
+              <w:left w:val="single" w:sz="4" w:space="0" w:color="000000"/>
+              <w:bottom w:val="single" w:sz="4" w:space="0" w:color="000000"/>
+              <w:right w:val="single" w:sz="4" w:space="0" w:color="000000"/>
+            </w:tcBorders>
+          </w:tcPr>
+          <w:p>
+            <w:pPr>
+              <w:rPr>
+                <w:rFonts w:cs="Latha"/>
+                <w:sz w:val="28"/>
+                <w:szCs w:val="28"/>
+                <w:cs/>
+                <w:lang w:bidi="ta-IN"/>
+              </w:rPr>
+            </w:pPr>
+            <w:r>
+              <w:rPr>
+                <w:rFonts w:cs="Latha"/>
+                <w:sz w:val="28"/>
+                <w:szCs w:val="28"/>
+                <w:cs/>
+                <w:lang w:bidi="ta-IN"/>
+              </w:rPr>
+              <w:t>ஸ</w:t>
+            </w:r>
+            <w:r>
+              <w:rPr>
+                <w:rFonts w:cs="Latha"/>
+                <w:sz w:val="28"/>
+                <w:szCs w:val="28"/>
+                <w:highlight w:val="green"/>
+                <w:cs/>
+                <w:lang w:bidi="ta-IN"/>
+              </w:rPr>
+              <w:t>மா</w:t>
+            </w:r>
+            <w:r>
+              <w:rPr>
+                <w:rFonts w:ascii="BRH Tamil Tab Extra" w:hAnsi="BRH Tamil Tab Extra" w:cs="Arial"/>
+                <w:b/>
+                <w:sz w:val="36"/>
+                <w:szCs w:val="28"/>
+              </w:rPr>
+              <w:t>…</w:t>
+            </w:r>
+            <w:r>
+              <w:rPr>
+                <w:rFonts w:cs="Latha"/>
+                <w:sz w:val="28"/>
+                <w:szCs w:val="28"/>
+                <w:cs/>
+                <w:lang w:bidi="ta-IN"/>
+              </w:rPr>
+              <w:t>ஶ்ச</w:t>
+            </w:r>
+            <w:r>
+              <w:rPr>
+                <w:rFonts w:ascii="Latha" w:hAnsi="Latha" w:cs="Latha"/>
+                <w:b/>
+                <w:bCs/>
+                <w:position w:val="-12"/>
+                <w:sz w:val="28"/>
+                <w:szCs w:val="28"/>
+                <w:cs/>
+                <w:lang w:bidi="ta-IN"/>
+              </w:rPr>
+              <w:t>2</w:t>
+            </w:r>
+            <w:r>
+              <w:rPr>
+                <w:rFonts w:cs="Latha"/>
+                <w:sz w:val="28"/>
+                <w:szCs w:val="28"/>
+                <w:cs/>
+                <w:lang w:bidi="ta-IN"/>
+              </w:rPr>
+              <w:t>ந்தோ</w:t>
+            </w:r>
+            <w:r>
+              <w:rPr>
+                <w:rFonts w:ascii="BRH Tamil Tab Extra" w:hAnsi="BRH Tamil Tab Extra" w:cs="Arial"/>
+                <w:b/>
+                <w:sz w:val="36"/>
+                <w:szCs w:val="28"/>
+              </w:rPr>
+              <w:t>…</w:t>
+            </w:r>
+            <w:r>
+              <w:rPr>
+                <w:rFonts w:ascii="Latha" w:hAnsi="Latha" w:cs="Latha"/>
+                <w:b/>
+                <w:bCs/>
+                <w:position w:val="-12"/>
+                <w:sz w:val="28"/>
+                <w:szCs w:val="28"/>
+                <w:cs/>
+                <w:lang w:bidi="ta-IN"/>
+              </w:rPr>
+              <w:t>3</w:t>
+            </w:r>
+            <w:r>
+              <w:rPr>
+                <w:rFonts w:cs="Arial"/>
+                <w:sz w:val="28"/>
+                <w:szCs w:val="28"/>
+                <w:cs/>
+                <w:lang w:bidi="ta-IN"/>
+              </w:rPr>
+              <w:t xml:space="preserve"> </w:t>
+            </w:r>
+            <w:r>
+              <w:rPr>
+                <w:rFonts w:cs="Latha"/>
+                <w:sz w:val="28"/>
+                <w:szCs w:val="28"/>
+                <w:cs/>
+                <w:lang w:bidi="ta-IN"/>
+              </w:rPr>
+              <w:t>நக்ஷ</w:t>
+            </w:r>
+            <w:r>
+              <w:rPr>
+                <w:rFonts w:ascii="BRH Tamil Tab Extra" w:hAnsi="BRH Tamil Tab Extra" w:cs="Arial"/>
+                <w:b/>
+                <w:sz w:val="36"/>
+                <w:szCs w:val="28"/>
+              </w:rPr>
+              <w:t>†</w:t>
+            </w:r>
+            <w:r>
+              <w:rPr>
+                <w:rFonts w:cs="Latha"/>
+                <w:sz w:val="28"/>
+                <w:szCs w:val="28"/>
+                <w:cs/>
+                <w:lang w:bidi="ta-IN"/>
+              </w:rPr>
+              <w:t>த்ராணி</w:t>
+            </w:r>
+            <w:r>
+              <w:rPr>
+                <w:rFonts w:ascii="BRH Tamil Tab Extra" w:hAnsi="BRH Tamil Tab Extra" w:cs="Arial"/>
+                <w:b/>
+                <w:sz w:val="36"/>
+                <w:szCs w:val="28"/>
+              </w:rPr>
+              <w:t>…</w:t>
+            </w:r>
+          </w:p>
+        </w:tc>
+      </w:tr>
+    </w:tbl>
+    <w:p>
+      <w:pPr>
+        <w:jc w:val="center"/>
+        <w:rPr>
+          <w:b/>
+          <w:bCs/>
+          <w:sz w:val="32"/>
+          <w:szCs w:val="32"/>
+          <w:u w:val="single"/>
+        </w:rPr>
+      </w:pPr>
+    </w:p>
+    <w:p>
+      <w:pPr>
+        <w:jc w:val="center"/>
+        <w:rPr>
+          <w:b/>
+          <w:bCs/>
+          <w:sz w:val="32"/>
+          <w:szCs w:val="32"/>
+          <w:u w:val="single"/>
+        </w:rPr>
+      </w:pPr>
+    </w:p>
+    <w:p>
+      <w:pPr>
+        <w:jc w:val="center"/>
+        <w:rPr>
+          <w:b/>
+          <w:bCs/>
+          <w:sz w:val="32"/>
+          <w:szCs w:val="32"/>
+          <w:u w:val="single"/>
+        </w:rPr>
+      </w:pPr>
+    </w:p>
+    <w:p>
+      <w:pPr>
+        <w:jc w:val="center"/>
+        <w:rPr>
+          <w:b/>
+          <w:bCs/>
+        </w:rPr>
+      </w:pPr>
+      <w:r>
+        <w:rPr>
+          <w:b/>
+          <w:bCs/>
+          <w:sz w:val="32"/>
+          <w:szCs w:val="32"/>
+          <w:u w:val="single"/>
+        </w:rPr>
+        <w:t>TaittirIya Samhit</w:t>
+      </w:r>
+      <w:r>
+        <w:rPr>
+          <w:b/>
+          <w:bCs/>
+          <w:sz w:val="32"/>
+          <w:szCs w:val="32"/>
+          <w:u w:val="single"/>
+        </w:rPr>
+        <w:t>A</w:t>
+      </w:r>
       <w:r>
         <w:rPr>
           <w:b/>
@@ -348,29 +1023,7 @@
                 <w:szCs w:val="28"/>
                 <w:lang w:bidi="ta-IN"/>
               </w:rPr>
-              <w:t xml:space="preserve"> - </w:t>
-            </w:r>
-            <w:proofErr w:type="spellStart"/>
-            <w:r>
-              <w:rPr>
-                <w:rFonts w:cs="Latha"/>
-                <w:b/>
-                <w:sz w:val="28"/>
-                <w:szCs w:val="28"/>
-                <w:lang w:bidi="ta-IN"/>
-              </w:rPr>
-              <w:t>Vaakyam</w:t>
-            </w:r>
-            <w:proofErr w:type="spellEnd"/>
-            <w:r>
-              <w:rPr>
-                <w:rFonts w:cs="Latha"/>
-                <w:b/>
-                <w:sz w:val="28"/>
-                <w:szCs w:val="28"/>
-                <w:lang w:bidi="ta-IN"/>
-              </w:rPr>
-              <w:t xml:space="preserve"> </w:t>
+              <w:t xml:space="preserve"> - Vaakyam </w:t>
             </w:r>
           </w:p>
           <w:p>
@@ -504,27 +1157,15 @@
                 <w:lang w:bidi="ta-IN"/>
               </w:rPr>
             </w:pPr>
-            <w:proofErr w:type="spellStart"/>
-            <w:r>
-              <w:rPr>
-                <w:rFonts w:cs="Latha"/>
-                <w:b/>
-                <w:sz w:val="28"/>
-                <w:szCs w:val="28"/>
-                <w:lang w:bidi="ta-IN"/>
-              </w:rPr>
-              <w:t>Panchaati</w:t>
-            </w:r>
-            <w:proofErr w:type="spellEnd"/>
-            <w:r>
-              <w:rPr>
-                <w:rFonts w:cs="Latha"/>
-                <w:b/>
-                <w:sz w:val="28"/>
-                <w:szCs w:val="28"/>
-                <w:lang w:bidi="ta-IN"/>
-              </w:rPr>
-              <w:t xml:space="preserve"> No. - </w:t>
+            <w:r>
+              <w:rPr>
+                <w:rFonts w:cs="Latha"/>
+                <w:b/>
+                <w:sz w:val="28"/>
+                <w:szCs w:val="28"/>
+                <w:lang w:bidi="ta-IN"/>
+              </w:rPr>
+              <w:t xml:space="preserve">Panchaati No. - </w:t>
             </w:r>
             <w:r>
               <w:rPr>
@@ -1440,6 +2081,7 @@
                 <w:szCs w:val="28"/>
                 <w:lang w:bidi="ta-IN"/>
               </w:rPr>
+              <w:lastRenderedPageBreak/>
               <w:t>TS 4.</w:t>
             </w:r>
             <w:r>
@@ -1480,29 +2122,7 @@
                 <w:szCs w:val="28"/>
                 <w:lang w:bidi="ta-IN"/>
               </w:rPr>
-              <w:t xml:space="preserve"> - </w:t>
-            </w:r>
-            <w:proofErr w:type="spellStart"/>
-            <w:r>
-              <w:rPr>
-                <w:rFonts w:cs="Latha"/>
-                <w:b/>
-                <w:sz w:val="28"/>
-                <w:szCs w:val="28"/>
-                <w:lang w:bidi="ta-IN"/>
-              </w:rPr>
-              <w:t>Vaakyam</w:t>
-            </w:r>
-            <w:proofErr w:type="spellEnd"/>
-            <w:r>
-              <w:rPr>
-                <w:rFonts w:cs="Latha"/>
-                <w:b/>
-                <w:sz w:val="28"/>
-                <w:szCs w:val="28"/>
-                <w:lang w:bidi="ta-IN"/>
-              </w:rPr>
-              <w:t xml:space="preserve"> </w:t>
+              <w:t xml:space="preserve"> - Vaakyam </w:t>
             </w:r>
           </w:p>
           <w:p>
@@ -2431,29 +3051,7 @@
                 <w:szCs w:val="28"/>
                 <w:lang w:bidi="ta-IN"/>
               </w:rPr>
-              <w:t xml:space="preserve"> - </w:t>
-            </w:r>
-            <w:proofErr w:type="spellStart"/>
-            <w:r>
-              <w:rPr>
-                <w:rFonts w:cs="Latha"/>
-                <w:b/>
-                <w:sz w:val="28"/>
-                <w:szCs w:val="28"/>
-                <w:lang w:bidi="ta-IN"/>
-              </w:rPr>
-              <w:t>Vaakyam</w:t>
-            </w:r>
-            <w:proofErr w:type="spellEnd"/>
-            <w:r>
-              <w:rPr>
-                <w:rFonts w:cs="Latha"/>
-                <w:b/>
-                <w:sz w:val="28"/>
-                <w:szCs w:val="28"/>
-                <w:lang w:bidi="ta-IN"/>
-              </w:rPr>
-              <w:t xml:space="preserve"> </w:t>
+              <w:t xml:space="preserve"> - Vaakyam </w:t>
             </w:r>
           </w:p>
           <w:p>
@@ -2509,27 +3107,15 @@
                 <w:lang w:bidi="ta-IN"/>
               </w:rPr>
             </w:pPr>
-            <w:proofErr w:type="spellStart"/>
-            <w:r>
-              <w:rPr>
-                <w:rFonts w:cs="Latha"/>
-                <w:b/>
-                <w:sz w:val="28"/>
-                <w:szCs w:val="28"/>
-                <w:lang w:bidi="ta-IN"/>
-              </w:rPr>
-              <w:t>Panchaati</w:t>
-            </w:r>
-            <w:proofErr w:type="spellEnd"/>
-            <w:r>
-              <w:rPr>
-                <w:rFonts w:cs="Latha"/>
-                <w:b/>
-                <w:sz w:val="28"/>
-                <w:szCs w:val="28"/>
-                <w:lang w:bidi="ta-IN"/>
-              </w:rPr>
-              <w:t xml:space="preserve"> No. - </w:t>
+            <w:r>
+              <w:rPr>
+                <w:rFonts w:cs="Latha"/>
+                <w:b/>
+                <w:sz w:val="28"/>
+                <w:szCs w:val="28"/>
+                <w:lang w:bidi="ta-IN"/>
+              </w:rPr>
+              <w:t xml:space="preserve">Panchaati No. - </w:t>
             </w:r>
             <w:r>
               <w:rPr>
@@ -3023,25 +3609,7 @@
                 <w:sz w:val="28"/>
                 <w:szCs w:val="28"/>
               </w:rPr>
-              <w:t xml:space="preserve">wrong </w:t>
-            </w:r>
-            <w:proofErr w:type="spellStart"/>
-            <w:r>
-              <w:rPr>
-                <w:rFonts w:cs="Arial"/>
-                <w:sz w:val="28"/>
-                <w:szCs w:val="28"/>
-              </w:rPr>
-              <w:t>swaram</w:t>
-            </w:r>
-            <w:proofErr w:type="spellEnd"/>
-            <w:r>
-              <w:rPr>
-                <w:rFonts w:cs="Arial"/>
-                <w:sz w:val="28"/>
-                <w:szCs w:val="28"/>
-              </w:rPr>
-              <w:t xml:space="preserve"> over </w:t>
+              <w:t xml:space="preserve">wrong swaram over </w:t>
             </w:r>
             <w:r>
               <w:rPr>
@@ -3148,29 +3716,7 @@
                 <w:szCs w:val="28"/>
                 <w:lang w:bidi="ta-IN"/>
               </w:rPr>
-              <w:t xml:space="preserve"> - </w:t>
-            </w:r>
-            <w:proofErr w:type="spellStart"/>
-            <w:r>
-              <w:rPr>
-                <w:rFonts w:cs="Latha"/>
-                <w:b/>
-                <w:sz w:val="28"/>
-                <w:szCs w:val="28"/>
-                <w:lang w:bidi="ta-IN"/>
-              </w:rPr>
-              <w:t>Vaakyam</w:t>
-            </w:r>
-            <w:proofErr w:type="spellEnd"/>
-            <w:r>
-              <w:rPr>
-                <w:rFonts w:cs="Latha"/>
-                <w:b/>
-                <w:sz w:val="28"/>
-                <w:szCs w:val="28"/>
-                <w:lang w:bidi="ta-IN"/>
-              </w:rPr>
-              <w:t xml:space="preserve"> </w:t>
+              <w:t xml:space="preserve"> - Vaakyam </w:t>
             </w:r>
           </w:p>
           <w:p>
@@ -3226,27 +3772,15 @@
                 <w:lang w:bidi="ta-IN"/>
               </w:rPr>
             </w:pPr>
-            <w:proofErr w:type="spellStart"/>
-            <w:r>
-              <w:rPr>
-                <w:rFonts w:cs="Latha"/>
-                <w:b/>
-                <w:sz w:val="28"/>
-                <w:szCs w:val="28"/>
-                <w:lang w:bidi="ta-IN"/>
-              </w:rPr>
-              <w:t>Panchaati</w:t>
-            </w:r>
-            <w:proofErr w:type="spellEnd"/>
-            <w:r>
-              <w:rPr>
-                <w:rFonts w:cs="Latha"/>
-                <w:b/>
-                <w:sz w:val="28"/>
-                <w:szCs w:val="28"/>
-                <w:lang w:bidi="ta-IN"/>
-              </w:rPr>
-              <w:t xml:space="preserve"> No. - </w:t>
+            <w:r>
+              <w:rPr>
+                <w:rFonts w:cs="Latha"/>
+                <w:b/>
+                <w:sz w:val="28"/>
+                <w:szCs w:val="28"/>
+                <w:lang w:bidi="ta-IN"/>
+              </w:rPr>
+              <w:t xml:space="preserve">Panchaati No. - </w:t>
             </w:r>
             <w:r>
               <w:rPr>
@@ -3623,25 +4157,7 @@
                 <w:sz w:val="28"/>
                 <w:szCs w:val="28"/>
               </w:rPr>
-              <w:t xml:space="preserve">(deletion of </w:t>
-            </w:r>
-            <w:proofErr w:type="spellStart"/>
-            <w:r>
-              <w:rPr>
-                <w:rFonts w:cs="Arial"/>
-                <w:sz w:val="28"/>
-                <w:szCs w:val="28"/>
-              </w:rPr>
-              <w:t>sa</w:t>
-            </w:r>
-            <w:proofErr w:type="spellEnd"/>
-            <w:r>
-              <w:rPr>
-                <w:rFonts w:cs="Arial"/>
-                <w:sz w:val="28"/>
-                <w:szCs w:val="28"/>
-              </w:rPr>
-              <w:t xml:space="preserve"> now added)</w:t>
+              <w:t>(deletion of sa now added)</w:t>
             </w:r>
           </w:p>
         </w:tc>
@@ -3679,7 +4195,6 @@
                 <w:szCs w:val="28"/>
                 <w:lang w:bidi="ta-IN"/>
               </w:rPr>
-              <w:lastRenderedPageBreak/>
               <w:t>TS 4.</w:t>
             </w:r>
             <w:r>
@@ -3720,29 +4235,7 @@
                 <w:szCs w:val="28"/>
                 <w:lang w:bidi="ta-IN"/>
               </w:rPr>
-              <w:t xml:space="preserve"> - </w:t>
-            </w:r>
-            <w:proofErr w:type="spellStart"/>
-            <w:r>
-              <w:rPr>
-                <w:rFonts w:cs="Latha"/>
-                <w:b/>
-                <w:sz w:val="28"/>
-                <w:szCs w:val="28"/>
-                <w:lang w:bidi="ta-IN"/>
-              </w:rPr>
-              <w:t>Vaakyam</w:t>
-            </w:r>
-            <w:proofErr w:type="spellEnd"/>
-            <w:r>
-              <w:rPr>
-                <w:rFonts w:cs="Latha"/>
-                <w:b/>
-                <w:sz w:val="28"/>
-                <w:szCs w:val="28"/>
-                <w:lang w:bidi="ta-IN"/>
-              </w:rPr>
-              <w:t xml:space="preserve"> </w:t>
+              <w:t xml:space="preserve"> - Vaakyam </w:t>
             </w:r>
           </w:p>
           <w:p>
@@ -3798,27 +4291,15 @@
                 <w:lang w:bidi="ta-IN"/>
               </w:rPr>
             </w:pPr>
-            <w:proofErr w:type="spellStart"/>
-            <w:r>
-              <w:rPr>
-                <w:rFonts w:cs="Latha"/>
-                <w:b/>
-                <w:sz w:val="28"/>
-                <w:szCs w:val="28"/>
-                <w:lang w:bidi="ta-IN"/>
-              </w:rPr>
-              <w:t>Panchaati</w:t>
-            </w:r>
-            <w:proofErr w:type="spellEnd"/>
-            <w:r>
-              <w:rPr>
-                <w:rFonts w:cs="Latha"/>
-                <w:b/>
-                <w:sz w:val="28"/>
-                <w:szCs w:val="28"/>
-                <w:lang w:bidi="ta-IN"/>
-              </w:rPr>
-              <w:t xml:space="preserve"> No. - </w:t>
+            <w:r>
+              <w:rPr>
+                <w:rFonts w:cs="Latha"/>
+                <w:b/>
+                <w:sz w:val="28"/>
+                <w:szCs w:val="28"/>
+                <w:lang w:bidi="ta-IN"/>
+              </w:rPr>
+              <w:t xml:space="preserve">Panchaati No. - </w:t>
             </w:r>
             <w:r>
               <w:rPr>
@@ -4179,7 +4660,6 @@
           <w:bCs/>
         </w:rPr>
       </w:pPr>
-      <w:proofErr w:type="spellStart"/>
       <w:r>
         <w:rPr>
           <w:b/>
@@ -4188,29 +4668,7 @@
           <w:szCs w:val="32"/>
           <w:u w:val="single"/>
         </w:rPr>
-        <w:t>TaittirIya</w:t>
-      </w:r>
-      <w:proofErr w:type="spellEnd"/>
-      <w:r>
-        <w:rPr>
-          <w:b/>
-          <w:bCs/>
-          <w:sz w:val="32"/>
-          <w:szCs w:val="32"/>
-          <w:u w:val="single"/>
-        </w:rPr>
-        <w:t xml:space="preserve"> </w:t>
-      </w:r>
-      <w:proofErr w:type="spellStart"/>
-      <w:r>
-        <w:rPr>
-          <w:b/>
-          <w:bCs/>
-          <w:sz w:val="32"/>
-          <w:szCs w:val="32"/>
-          <w:u w:val="single"/>
-        </w:rPr>
-        <w:t>Samhit</w:t>
+        <w:t>TaittirIya Samhit</w:t>
       </w:r>
       <w:r>
         <w:rPr>
@@ -4222,7 +4680,6 @@
         </w:rPr>
         <w:t>A</w:t>
       </w:r>
-      <w:proofErr w:type="spellEnd"/>
       <w:r>
         <w:rPr>
           <w:b/>
@@ -4487,29 +4944,7 @@
                 <w:szCs w:val="28"/>
                 <w:lang w:bidi="ta-IN"/>
               </w:rPr>
-              <w:t xml:space="preserve"> - </w:t>
-            </w:r>
-            <w:proofErr w:type="spellStart"/>
-            <w:r>
-              <w:rPr>
-                <w:rFonts w:cs="Latha"/>
-                <w:b/>
-                <w:sz w:val="28"/>
-                <w:szCs w:val="28"/>
-                <w:lang w:bidi="ta-IN"/>
-              </w:rPr>
-              <w:t>Vaakyam</w:t>
-            </w:r>
-            <w:proofErr w:type="spellEnd"/>
-            <w:r>
-              <w:rPr>
-                <w:rFonts w:cs="Latha"/>
-                <w:b/>
-                <w:sz w:val="28"/>
-                <w:szCs w:val="28"/>
-                <w:lang w:bidi="ta-IN"/>
-              </w:rPr>
-              <w:t xml:space="preserve"> </w:t>
+              <w:t xml:space="preserve"> - Vaakyam </w:t>
             </w:r>
           </w:p>
           <w:p>
@@ -4565,27 +5000,15 @@
                 <w:lang w:bidi="ta-IN"/>
               </w:rPr>
             </w:pPr>
-            <w:proofErr w:type="spellStart"/>
-            <w:r>
-              <w:rPr>
-                <w:rFonts w:cs="Latha"/>
-                <w:b/>
-                <w:sz w:val="28"/>
-                <w:szCs w:val="28"/>
-                <w:lang w:bidi="ta-IN"/>
-              </w:rPr>
-              <w:t>Panchaati</w:t>
-            </w:r>
-            <w:proofErr w:type="spellEnd"/>
-            <w:r>
-              <w:rPr>
-                <w:rFonts w:cs="Latha"/>
-                <w:b/>
-                <w:sz w:val="28"/>
-                <w:szCs w:val="28"/>
-                <w:lang w:bidi="ta-IN"/>
-              </w:rPr>
-              <w:t xml:space="preserve"> No. - </w:t>
+            <w:r>
+              <w:rPr>
+                <w:rFonts w:cs="Latha"/>
+                <w:b/>
+                <w:sz w:val="28"/>
+                <w:szCs w:val="28"/>
+                <w:lang w:bidi="ta-IN"/>
+              </w:rPr>
+              <w:t xml:space="preserve">Panchaati No. - </w:t>
             </w:r>
             <w:r>
               <w:rPr>
@@ -4943,6 +5366,7 @@
                 <w:szCs w:val="28"/>
                 <w:lang w:eastAsia="en-IN" w:bidi="ml-IN"/>
               </w:rPr>
+              <w:lastRenderedPageBreak/>
               <w:t>TS 4.</w:t>
             </w:r>
             <w:r>
@@ -4973,20 +5397,8 @@
                 <w:szCs w:val="28"/>
                 <w:lang w:bidi="ta-IN"/>
               </w:rPr>
-              <w:t xml:space="preserve"> </w:t>
-            </w:r>
-            <w:proofErr w:type="spellStart"/>
-            <w:r>
-              <w:rPr>
-                <w:rFonts w:cs="Latha"/>
-                <w:b/>
-                <w:sz w:val="28"/>
-                <w:szCs w:val="28"/>
-                <w:lang w:bidi="ta-IN"/>
-              </w:rPr>
-              <w:t>Vaakyam</w:t>
-            </w:r>
-            <w:proofErr w:type="spellEnd"/>
+              <w:t xml:space="preserve"> Vaakyam</w:t>
+            </w:r>
           </w:p>
           <w:p>
             <w:pPr>
@@ -5035,27 +5447,15 @@
                 <w:lang w:val="en-IN" w:bidi="ta-IN"/>
               </w:rPr>
             </w:pPr>
-            <w:proofErr w:type="spellStart"/>
-            <w:r>
-              <w:rPr>
-                <w:rFonts w:cs="Latha"/>
-                <w:b/>
-                <w:sz w:val="28"/>
-                <w:szCs w:val="28"/>
-                <w:lang w:bidi="ta-IN"/>
-              </w:rPr>
-              <w:t>Panchaati</w:t>
-            </w:r>
-            <w:proofErr w:type="spellEnd"/>
-            <w:r>
-              <w:rPr>
-                <w:rFonts w:cs="Latha"/>
-                <w:b/>
-                <w:sz w:val="28"/>
-                <w:szCs w:val="28"/>
-                <w:lang w:bidi="ta-IN"/>
-              </w:rPr>
-              <w:t xml:space="preserve"> No. - </w:t>
+            <w:r>
+              <w:rPr>
+                <w:rFonts w:cs="Latha"/>
+                <w:b/>
+                <w:sz w:val="28"/>
+                <w:szCs w:val="28"/>
+                <w:lang w:bidi="ta-IN"/>
+              </w:rPr>
+              <w:t xml:space="preserve">Panchaati No. - </w:t>
             </w:r>
             <w:r>
               <w:rPr>
@@ -5490,29 +5890,7 @@
                 <w:szCs w:val="28"/>
                 <w:lang w:bidi="ta-IN"/>
               </w:rPr>
-              <w:t xml:space="preserve"> - </w:t>
-            </w:r>
-            <w:proofErr w:type="spellStart"/>
-            <w:r>
-              <w:rPr>
-                <w:rFonts w:cs="Latha"/>
-                <w:b/>
-                <w:sz w:val="28"/>
-                <w:szCs w:val="28"/>
-                <w:lang w:bidi="ta-IN"/>
-              </w:rPr>
-              <w:t>Vaakyam</w:t>
-            </w:r>
-            <w:proofErr w:type="spellEnd"/>
-            <w:r>
-              <w:rPr>
-                <w:rFonts w:cs="Latha"/>
-                <w:b/>
-                <w:sz w:val="28"/>
-                <w:szCs w:val="28"/>
-                <w:lang w:bidi="ta-IN"/>
-              </w:rPr>
-              <w:t xml:space="preserve"> </w:t>
+              <w:t xml:space="preserve"> - Vaakyam </w:t>
             </w:r>
           </w:p>
           <w:p>
@@ -5568,27 +5946,15 @@
                 <w:lang w:bidi="ta-IN"/>
               </w:rPr>
             </w:pPr>
-            <w:proofErr w:type="spellStart"/>
-            <w:r>
-              <w:rPr>
-                <w:rFonts w:cs="Latha"/>
-                <w:b/>
-                <w:sz w:val="28"/>
-                <w:szCs w:val="28"/>
-                <w:lang w:bidi="ta-IN"/>
-              </w:rPr>
-              <w:t>Panchaati</w:t>
-            </w:r>
-            <w:proofErr w:type="spellEnd"/>
-            <w:r>
-              <w:rPr>
-                <w:rFonts w:cs="Latha"/>
-                <w:b/>
-                <w:sz w:val="28"/>
-                <w:szCs w:val="28"/>
-                <w:lang w:bidi="ta-IN"/>
-              </w:rPr>
-              <w:t xml:space="preserve"> No. - </w:t>
+            <w:r>
+              <w:rPr>
+                <w:rFonts w:cs="Latha"/>
+                <w:b/>
+                <w:sz w:val="28"/>
+                <w:szCs w:val="28"/>
+                <w:lang w:bidi="ta-IN"/>
+              </w:rPr>
+              <w:t xml:space="preserve">Panchaati No. - </w:t>
             </w:r>
             <w:r>
               <w:rPr>
@@ -5924,7 +6290,6 @@
               </w:rPr>
               <w:t xml:space="preserve"> - </w:t>
             </w:r>
-            <w:proofErr w:type="spellStart"/>
             <w:r>
               <w:rPr>
                 <w:rFonts w:cs="Latha"/>
@@ -5935,7 +6300,6 @@
               </w:rPr>
               <w:t>Vaakyam</w:t>
             </w:r>
-            <w:proofErr w:type="spellEnd"/>
             <w:r>
               <w:rPr>
                 <w:rFonts w:cs="Latha"/>
@@ -6000,27 +6364,15 @@
                 <w:lang w:bidi="ta-IN"/>
               </w:rPr>
             </w:pPr>
-            <w:proofErr w:type="spellStart"/>
-            <w:r>
-              <w:rPr>
-                <w:rFonts w:cs="Latha"/>
-                <w:b/>
-                <w:sz w:val="28"/>
-                <w:szCs w:val="28"/>
-                <w:lang w:bidi="ta-IN"/>
-              </w:rPr>
-              <w:t>Panchaati</w:t>
-            </w:r>
-            <w:proofErr w:type="spellEnd"/>
-            <w:r>
-              <w:rPr>
-                <w:rFonts w:cs="Latha"/>
-                <w:b/>
-                <w:sz w:val="28"/>
-                <w:szCs w:val="28"/>
-                <w:lang w:bidi="ta-IN"/>
-              </w:rPr>
-              <w:t xml:space="preserve"> No. - </w:t>
+            <w:r>
+              <w:rPr>
+                <w:rFonts w:cs="Latha"/>
+                <w:b/>
+                <w:sz w:val="28"/>
+                <w:szCs w:val="28"/>
+                <w:lang w:bidi="ta-IN"/>
+              </w:rPr>
+              <w:t xml:space="preserve">Panchaati No. - </w:t>
             </w:r>
             <w:r>
               <w:rPr>
@@ -6380,7 +6732,6 @@
           <w:u w:val="single"/>
         </w:rPr>
       </w:pPr>
-      <w:proofErr w:type="spellStart"/>
       <w:r>
         <w:rPr>
           <w:b/>
@@ -6389,30 +6740,7 @@
           <w:szCs w:val="32"/>
           <w:u w:val="single"/>
         </w:rPr>
-        <w:lastRenderedPageBreak/>
-        <w:t>TaittirIya</w:t>
-      </w:r>
-      <w:proofErr w:type="spellEnd"/>
-      <w:r>
-        <w:rPr>
-          <w:b/>
-          <w:bCs/>
-          <w:sz w:val="32"/>
-          <w:szCs w:val="32"/>
-          <w:u w:val="single"/>
-        </w:rPr>
-        <w:t xml:space="preserve"> </w:t>
-      </w:r>
-      <w:proofErr w:type="spellStart"/>
-      <w:r>
-        <w:rPr>
-          <w:b/>
-          <w:bCs/>
-          <w:sz w:val="32"/>
-          <w:szCs w:val="32"/>
-          <w:u w:val="single"/>
-        </w:rPr>
-        <w:t>Samhit</w:t>
+        <w:t>TaittirIya Samhit</w:t>
       </w:r>
       <w:r>
         <w:rPr>
@@ -6424,7 +6752,6 @@
         </w:rPr>
         <w:t>A</w:t>
       </w:r>
-      <w:proofErr w:type="spellEnd"/>
       <w:r>
         <w:rPr>
           <w:b/>
@@ -6676,20 +7003,8 @@
                 <w:szCs w:val="28"/>
                 <w:lang w:bidi="ta-IN"/>
               </w:rPr>
-              <w:t xml:space="preserve">TS 4.1.2.2 - </w:t>
-            </w:r>
-            <w:proofErr w:type="spellStart"/>
-            <w:r>
-              <w:rPr>
-                <w:rFonts w:cs="Latha"/>
-                <w:b/>
-                <w:sz w:val="28"/>
-                <w:szCs w:val="28"/>
-                <w:lang w:bidi="ta-IN"/>
-              </w:rPr>
-              <w:t>Vaakyam</w:t>
-            </w:r>
-            <w:proofErr w:type="spellEnd"/>
+              <w:t>TS 4.1.2.2 - Vaakyam</w:t>
+            </w:r>
           </w:p>
           <w:p>
             <w:pPr>
@@ -6735,27 +7050,15 @@
                 <w:lang w:bidi="ta-IN"/>
               </w:rPr>
             </w:pPr>
-            <w:proofErr w:type="spellStart"/>
-            <w:r>
-              <w:rPr>
-                <w:rFonts w:cs="Latha"/>
-                <w:b/>
-                <w:sz w:val="28"/>
-                <w:szCs w:val="28"/>
-                <w:lang w:bidi="ta-IN"/>
-              </w:rPr>
-              <w:t>Panchaati</w:t>
-            </w:r>
-            <w:proofErr w:type="spellEnd"/>
-            <w:r>
-              <w:rPr>
-                <w:rFonts w:cs="Latha"/>
-                <w:b/>
-                <w:sz w:val="28"/>
-                <w:szCs w:val="28"/>
-                <w:lang w:bidi="ta-IN"/>
-              </w:rPr>
-              <w:t xml:space="preserve"> No. - 6</w:t>
+            <w:r>
+              <w:rPr>
+                <w:rFonts w:cs="Latha"/>
+                <w:b/>
+                <w:sz w:val="28"/>
+                <w:szCs w:val="28"/>
+                <w:lang w:bidi="ta-IN"/>
+              </w:rPr>
+              <w:t>Panchaati No. - 6</w:t>
             </w:r>
           </w:p>
         </w:tc>
@@ -7352,20 +7655,9 @@
                 <w:szCs w:val="28"/>
                 <w:lang w:bidi="ta-IN"/>
               </w:rPr>
-              <w:t xml:space="preserve">TS 4.1.10.4 - </w:t>
-            </w:r>
-            <w:proofErr w:type="spellStart"/>
-            <w:r>
-              <w:rPr>
-                <w:rFonts w:cs="Latha"/>
-                <w:b/>
-                <w:sz w:val="28"/>
-                <w:szCs w:val="28"/>
-                <w:lang w:bidi="ta-IN"/>
-              </w:rPr>
-              <w:t>Vaakyam</w:t>
-            </w:r>
-            <w:proofErr w:type="spellEnd"/>
+              <w:lastRenderedPageBreak/>
+              <w:t>TS 4.1.10.4 - Vaakyam</w:t>
+            </w:r>
           </w:p>
           <w:p>
             <w:pPr>
@@ -7414,27 +7706,15 @@
                 <w:lang w:eastAsia="en-IN" w:bidi="ml-IN"/>
               </w:rPr>
             </w:pPr>
-            <w:proofErr w:type="spellStart"/>
-            <w:r>
-              <w:rPr>
-                <w:rFonts w:cs="Latha"/>
-                <w:b/>
-                <w:sz w:val="28"/>
-                <w:szCs w:val="28"/>
-                <w:lang w:bidi="ta-IN"/>
-              </w:rPr>
-              <w:t>Panchaati</w:t>
-            </w:r>
-            <w:proofErr w:type="spellEnd"/>
-            <w:r>
-              <w:rPr>
-                <w:rFonts w:cs="Latha"/>
-                <w:b/>
-                <w:sz w:val="28"/>
-                <w:szCs w:val="28"/>
-                <w:lang w:bidi="ta-IN"/>
-              </w:rPr>
-              <w:t xml:space="preserve"> No. - 41</w:t>
+            <w:r>
+              <w:rPr>
+                <w:rFonts w:cs="Latha"/>
+                <w:b/>
+                <w:sz w:val="28"/>
+                <w:szCs w:val="28"/>
+                <w:lang w:bidi="ta-IN"/>
+              </w:rPr>
+              <w:t>Panchaati No. - 41</w:t>
             </w:r>
           </w:p>
         </w:tc>
@@ -7789,20 +8069,8 @@
                 <w:szCs w:val="28"/>
                 <w:lang w:bidi="ta-IN"/>
               </w:rPr>
-              <w:t xml:space="preserve">TS 4.4.2.1 - </w:t>
-            </w:r>
-            <w:proofErr w:type="spellStart"/>
-            <w:r>
-              <w:rPr>
-                <w:rFonts w:cs="Latha"/>
-                <w:b/>
-                <w:sz w:val="28"/>
-                <w:szCs w:val="28"/>
-                <w:lang w:bidi="ta-IN"/>
-              </w:rPr>
-              <w:t>Vaakyam</w:t>
-            </w:r>
-            <w:proofErr w:type="spellEnd"/>
+              <w:t>TS 4.4.2.1 - Vaakyam</w:t>
+            </w:r>
           </w:p>
           <w:p>
             <w:pPr>
@@ -7838,27 +8106,15 @@
                 <w:lang w:bidi="ta-IN"/>
               </w:rPr>
             </w:pPr>
-            <w:proofErr w:type="spellStart"/>
-            <w:r>
-              <w:rPr>
-                <w:rFonts w:cs="Latha"/>
-                <w:b/>
-                <w:sz w:val="28"/>
-                <w:szCs w:val="28"/>
-                <w:lang w:bidi="ta-IN"/>
-              </w:rPr>
-              <w:t>Panchaati</w:t>
-            </w:r>
-            <w:proofErr w:type="spellEnd"/>
-            <w:r>
-              <w:rPr>
-                <w:rFonts w:cs="Latha"/>
-                <w:b/>
-                <w:sz w:val="28"/>
-                <w:szCs w:val="28"/>
-                <w:lang w:bidi="ta-IN"/>
-              </w:rPr>
-              <w:t xml:space="preserve"> No. - 4</w:t>
+            <w:r>
+              <w:rPr>
+                <w:rFonts w:cs="Latha"/>
+                <w:b/>
+                <w:sz w:val="28"/>
+                <w:szCs w:val="28"/>
+                <w:lang w:bidi="ta-IN"/>
+              </w:rPr>
+              <w:t>Panchaati No. - 4</w:t>
             </w:r>
           </w:p>
         </w:tc>
@@ -8266,10 +8522,12 @@
                 <w:szCs w:val="32"/>
                 <w:lang w:bidi="ta-IN"/>
               </w:rPr>
-              <w:t xml:space="preserve">4.5.11.1 – </w:t>
-            </w:r>
-            <w:proofErr w:type="spellStart"/>
-            <w:r>
+              <w:t>4.5.11.1 – Vaakyam</w:t>
+            </w:r>
+          </w:p>
+          <w:p>
+            <w:pPr>
+              <w:spacing w:before="0" w:line="240" w:lineRule="auto"/>
               <w:rPr>
                 <w:rFonts w:cs="Arial"/>
                 <w:b/>
@@ -8277,13 +8535,8 @@
                 <w:szCs w:val="32"/>
                 <w:lang w:bidi="ta-IN"/>
               </w:rPr>
-              <w:t>Vaakyam</w:t>
-            </w:r>
-            <w:proofErr w:type="spellEnd"/>
-          </w:p>
-          <w:p>
-            <w:pPr>
-              <w:spacing w:before="0" w:line="240" w:lineRule="auto"/>
+            </w:pPr>
+            <w:r>
               <w:rPr>
                 <w:rFonts w:cs="Arial"/>
                 <w:b/>
@@ -8291,29 +8544,8 @@
                 <w:szCs w:val="32"/>
                 <w:lang w:bidi="ta-IN"/>
               </w:rPr>
-            </w:pPr>
-            <w:r>
-              <w:rPr>
-                <w:rFonts w:cs="Arial"/>
-                <w:b/>
-                <w:sz w:val="28"/>
-                <w:szCs w:val="32"/>
-                <w:lang w:bidi="ta-IN"/>
-              </w:rPr>
-              <w:t xml:space="preserve">Line No. </w:t>
-            </w:r>
-            <w:proofErr w:type="gramStart"/>
-            <w:r>
-              <w:rPr>
-                <w:rFonts w:cs="Arial"/>
-                <w:b/>
-                <w:sz w:val="28"/>
-                <w:szCs w:val="32"/>
-                <w:lang w:bidi="ta-IN"/>
-              </w:rPr>
-              <w:t>–  7</w:t>
-            </w:r>
-            <w:proofErr w:type="gramEnd"/>
+              <w:t>Line No. –  7</w:t>
+            </w:r>
           </w:p>
           <w:p>
             <w:pPr>
@@ -8326,7 +8558,6 @@
                 <w:lang w:bidi="ta-IN"/>
               </w:rPr>
             </w:pPr>
-            <w:proofErr w:type="spellStart"/>
             <w:r>
               <w:rPr>
                 <w:rFonts w:cs="Arial"/>
@@ -8335,18 +8566,7 @@
                 <w:szCs w:val="32"/>
                 <w:lang w:bidi="ta-IN"/>
               </w:rPr>
-              <w:t>Paanchati</w:t>
-            </w:r>
-            <w:proofErr w:type="spellEnd"/>
-            <w:r>
-              <w:rPr>
-                <w:rFonts w:cs="Arial"/>
-                <w:b/>
-                <w:sz w:val="28"/>
-                <w:szCs w:val="32"/>
-                <w:lang w:bidi="ta-IN"/>
-              </w:rPr>
-              <w:t xml:space="preserve"> No -</w:t>
+              <w:t>Paanchati No -</w:t>
             </w:r>
             <w:r>
               <w:rPr>
@@ -8786,20 +9006,8 @@
                 <w:szCs w:val="28"/>
                 <w:lang w:bidi="ta-IN"/>
               </w:rPr>
-              <w:t xml:space="preserve">TS 4.7.1.1 - </w:t>
-            </w:r>
-            <w:proofErr w:type="spellStart"/>
-            <w:r>
-              <w:rPr>
-                <w:rFonts w:cs="Latha"/>
-                <w:b/>
-                <w:sz w:val="28"/>
-                <w:szCs w:val="28"/>
-                <w:lang w:bidi="ta-IN"/>
-              </w:rPr>
-              <w:t>Vaakyam</w:t>
-            </w:r>
-            <w:proofErr w:type="spellEnd"/>
+              <w:t>TS 4.7.1.1 - Vaakyam</w:t>
+            </w:r>
           </w:p>
           <w:p>
             <w:pPr>
@@ -8837,27 +9045,15 @@
                 <w:szCs w:val="28"/>
               </w:rPr>
             </w:pPr>
-            <w:proofErr w:type="spellStart"/>
-            <w:r>
-              <w:rPr>
-                <w:rFonts w:cs="Latha"/>
-                <w:b/>
-                <w:sz w:val="28"/>
-                <w:szCs w:val="28"/>
-                <w:lang w:bidi="ta-IN"/>
-              </w:rPr>
-              <w:t>Panchaati</w:t>
-            </w:r>
-            <w:proofErr w:type="spellEnd"/>
-            <w:r>
-              <w:rPr>
-                <w:rFonts w:cs="Latha"/>
-                <w:b/>
-                <w:sz w:val="28"/>
-                <w:szCs w:val="28"/>
-                <w:lang w:bidi="ta-IN"/>
-              </w:rPr>
-              <w:t xml:space="preserve"> No. - 1</w:t>
+            <w:r>
+              <w:rPr>
+                <w:rFonts w:cs="Latha"/>
+                <w:b/>
+                <w:sz w:val="28"/>
+                <w:szCs w:val="28"/>
+                <w:lang w:bidi="ta-IN"/>
+              </w:rPr>
+              <w:t>Panchaati No. - 1</w:t>
             </w:r>
           </w:p>
         </w:tc>
@@ -9324,7 +9520,6 @@
           <w:u w:val="single"/>
         </w:rPr>
       </w:pPr>
-      <w:proofErr w:type="spellStart"/>
       <w:r>
         <w:rPr>
           <w:b/>
@@ -9333,19 +9528,7 @@
           <w:szCs w:val="32"/>
           <w:u w:val="single"/>
         </w:rPr>
-        <w:lastRenderedPageBreak/>
-        <w:t>TaittirIya</w:t>
-      </w:r>
-      <w:proofErr w:type="spellEnd"/>
-      <w:r>
-        <w:rPr>
-          <w:b/>
-          <w:bCs/>
-          <w:sz w:val="32"/>
-          <w:szCs w:val="32"/>
-          <w:u w:val="single"/>
-        </w:rPr>
-        <w:t xml:space="preserve"> Samhita –TS  4 Tamil </w:t>
+        <w:t xml:space="preserve">TaittirIya Samhita –TS  4 Tamil </w:t>
       </w:r>
       <w:r>
         <w:rPr>
@@ -9627,29 +9810,16 @@
                 <w:lang w:bidi="ta-IN"/>
               </w:rPr>
             </w:pPr>
-            <w:proofErr w:type="spellStart"/>
-            <w:r>
-              <w:rPr>
-                <w:rFonts w:cs="Latha"/>
-                <w:b/>
-                <w:bCs/>
-                <w:sz w:val="28"/>
-                <w:szCs w:val="28"/>
-                <w:lang w:bidi="ta-IN"/>
-              </w:rPr>
-              <w:t>Panchaati</w:t>
-            </w:r>
-            <w:proofErr w:type="spellEnd"/>
-            <w:r>
-              <w:rPr>
-                <w:rFonts w:cs="Latha"/>
-                <w:b/>
-                <w:bCs/>
-                <w:sz w:val="28"/>
-                <w:szCs w:val="28"/>
-                <w:lang w:bidi="ta-IN"/>
-              </w:rPr>
-              <w:t xml:space="preserve"> 17</w:t>
+            <w:r>
+              <w:rPr>
+                <w:rFonts w:cs="Latha"/>
+                <w:b/>
+                <w:bCs/>
+                <w:sz w:val="28"/>
+                <w:szCs w:val="28"/>
+                <w:lang w:bidi="ta-IN"/>
+              </w:rPr>
+              <w:t>Panchaati 17</w:t>
             </w:r>
           </w:p>
           <w:p>
@@ -10119,6 +10289,7 @@
                 <w:szCs w:val="28"/>
                 <w:lang w:bidi="ta-IN"/>
               </w:rPr>
+              <w:lastRenderedPageBreak/>
               <w:t>TS 4.2.3.2</w:t>
             </w:r>
           </w:p>
@@ -10138,29 +10309,16 @@
                 <w:lang w:bidi="ta-IN"/>
               </w:rPr>
             </w:pPr>
-            <w:proofErr w:type="spellStart"/>
-            <w:r>
-              <w:rPr>
-                <w:rFonts w:cs="Latha"/>
-                <w:b/>
-                <w:bCs/>
-                <w:sz w:val="28"/>
-                <w:szCs w:val="28"/>
-                <w:lang w:bidi="ta-IN"/>
-              </w:rPr>
-              <w:t>Panchaati</w:t>
-            </w:r>
-            <w:proofErr w:type="spellEnd"/>
-            <w:r>
-              <w:rPr>
-                <w:rFonts w:cs="Latha"/>
-                <w:b/>
-                <w:bCs/>
-                <w:sz w:val="28"/>
-                <w:szCs w:val="28"/>
-                <w:lang w:bidi="ta-IN"/>
-              </w:rPr>
-              <w:t xml:space="preserve"> 11</w:t>
+            <w:r>
+              <w:rPr>
+                <w:rFonts w:cs="Latha"/>
+                <w:b/>
+                <w:bCs/>
+                <w:sz w:val="28"/>
+                <w:szCs w:val="28"/>
+                <w:lang w:bidi="ta-IN"/>
+              </w:rPr>
+              <w:t>Panchaati 11</w:t>
             </w:r>
           </w:p>
           <w:p>
@@ -10564,30 +10722,7 @@
                 <w:lang w:bidi="ta-IN"/>
               </w:rPr>
               <w:br/>
-            </w:r>
-            <w:proofErr w:type="spellStart"/>
-            <w:r>
-              <w:rPr>
-                <w:rFonts w:cs="Latha"/>
-                <w:b/>
-                <w:bCs/>
-                <w:sz w:val="28"/>
-                <w:szCs w:val="28"/>
-                <w:lang w:bidi="ta-IN"/>
-              </w:rPr>
-              <w:t>Panchaati</w:t>
-            </w:r>
-            <w:proofErr w:type="spellEnd"/>
-            <w:r>
-              <w:rPr>
-                <w:rFonts w:cs="Latha"/>
-                <w:b/>
-                <w:bCs/>
-                <w:sz w:val="28"/>
-                <w:szCs w:val="28"/>
-                <w:lang w:bidi="ta-IN"/>
-              </w:rPr>
-              <w:t xml:space="preserve"> 37</w:t>
+              <w:t>Panchaati 37</w:t>
             </w:r>
           </w:p>
           <w:p>
@@ -10943,29 +11078,7 @@
                 <w:szCs w:val="28"/>
                 <w:lang w:bidi="ta-IN"/>
               </w:rPr>
-              <w:t xml:space="preserve">TS 4.2.9.3 - </w:t>
-            </w:r>
-            <w:proofErr w:type="spellStart"/>
-            <w:r>
-              <w:rPr>
-                <w:rFonts w:cs="Latha"/>
-                <w:b/>
-                <w:sz w:val="28"/>
-                <w:szCs w:val="28"/>
-                <w:lang w:bidi="ta-IN"/>
-              </w:rPr>
-              <w:t>Vaakyam</w:t>
-            </w:r>
-            <w:proofErr w:type="spellEnd"/>
-            <w:r>
-              <w:rPr>
-                <w:rFonts w:cs="Latha"/>
-                <w:b/>
-                <w:sz w:val="28"/>
-                <w:szCs w:val="28"/>
-                <w:lang w:bidi="ta-IN"/>
-              </w:rPr>
-              <w:t xml:space="preserve"> </w:t>
+              <w:t xml:space="preserve">TS 4.2.9.3 - Vaakyam </w:t>
             </w:r>
           </w:p>
           <w:p>
@@ -11006,27 +11119,15 @@
                 <w:lang w:bidi="ta-IN"/>
               </w:rPr>
             </w:pPr>
-            <w:proofErr w:type="spellStart"/>
-            <w:r>
-              <w:rPr>
-                <w:rFonts w:cs="Latha"/>
-                <w:b/>
-                <w:sz w:val="28"/>
-                <w:szCs w:val="28"/>
-                <w:lang w:bidi="ta-IN"/>
-              </w:rPr>
-              <w:t>Panchaati</w:t>
-            </w:r>
-            <w:proofErr w:type="spellEnd"/>
-            <w:r>
-              <w:rPr>
-                <w:rFonts w:cs="Latha"/>
-                <w:b/>
-                <w:sz w:val="28"/>
-                <w:szCs w:val="28"/>
-                <w:lang w:bidi="ta-IN"/>
-              </w:rPr>
-              <w:t xml:space="preserve"> No. - 38</w:t>
+            <w:r>
+              <w:rPr>
+                <w:rFonts w:cs="Latha"/>
+                <w:b/>
+                <w:sz w:val="28"/>
+                <w:szCs w:val="28"/>
+                <w:lang w:bidi="ta-IN"/>
+              </w:rPr>
+              <w:t>Panchaati No. - 38</w:t>
             </w:r>
           </w:p>
         </w:tc>
@@ -11345,29 +11446,16 @@
                 <w:lang w:bidi="ta-IN"/>
               </w:rPr>
             </w:pPr>
-            <w:proofErr w:type="spellStart"/>
-            <w:r>
-              <w:rPr>
-                <w:rFonts w:cs="Latha"/>
-                <w:b/>
-                <w:bCs/>
-                <w:sz w:val="28"/>
-                <w:szCs w:val="28"/>
-                <w:lang w:bidi="ta-IN"/>
-              </w:rPr>
-              <w:t>Panchaati</w:t>
-            </w:r>
-            <w:proofErr w:type="spellEnd"/>
-            <w:r>
-              <w:rPr>
-                <w:rFonts w:cs="Latha"/>
-                <w:b/>
-                <w:bCs/>
-                <w:sz w:val="28"/>
-                <w:szCs w:val="28"/>
-                <w:lang w:bidi="ta-IN"/>
-              </w:rPr>
-              <w:t xml:space="preserve"> 41</w:t>
+            <w:r>
+              <w:rPr>
+                <w:rFonts w:cs="Latha"/>
+                <w:b/>
+                <w:bCs/>
+                <w:sz w:val="28"/>
+                <w:szCs w:val="28"/>
+                <w:lang w:bidi="ta-IN"/>
+              </w:rPr>
+              <w:t>Panchaati 41</w:t>
             </w:r>
           </w:p>
           <w:p>
@@ -11921,7 +12009,6 @@
                 <w:szCs w:val="28"/>
                 <w:lang w:bidi="ta-IN"/>
               </w:rPr>
-              <w:lastRenderedPageBreak/>
               <w:t>TS 4.2.10.2</w:t>
             </w:r>
           </w:p>
@@ -11941,29 +12028,16 @@
                 <w:lang w:bidi="ta-IN"/>
               </w:rPr>
             </w:pPr>
-            <w:proofErr w:type="spellStart"/>
-            <w:r>
-              <w:rPr>
-                <w:rFonts w:cs="Latha"/>
-                <w:b/>
-                <w:bCs/>
-                <w:sz w:val="28"/>
-                <w:szCs w:val="28"/>
-                <w:lang w:bidi="ta-IN"/>
-              </w:rPr>
-              <w:t>Panchaati</w:t>
-            </w:r>
-            <w:proofErr w:type="spellEnd"/>
-            <w:r>
-              <w:rPr>
-                <w:rFonts w:cs="Latha"/>
-                <w:b/>
-                <w:bCs/>
-                <w:sz w:val="28"/>
-                <w:szCs w:val="28"/>
-                <w:lang w:bidi="ta-IN"/>
-              </w:rPr>
-              <w:t xml:space="preserve"> 43</w:t>
+            <w:r>
+              <w:rPr>
+                <w:rFonts w:cs="Latha"/>
+                <w:b/>
+                <w:bCs/>
+                <w:sz w:val="28"/>
+                <w:szCs w:val="28"/>
+                <w:lang w:bidi="ta-IN"/>
+              </w:rPr>
+              <w:t>Panchaati 43</w:t>
             </w:r>
           </w:p>
           <w:p>
@@ -12484,29 +12558,16 @@
                 <w:lang w:bidi="ta-IN"/>
               </w:rPr>
             </w:pPr>
-            <w:proofErr w:type="spellStart"/>
-            <w:r>
-              <w:rPr>
-                <w:rFonts w:cs="Latha"/>
-                <w:b/>
-                <w:bCs/>
-                <w:sz w:val="28"/>
-                <w:szCs w:val="28"/>
-                <w:lang w:bidi="ta-IN"/>
-              </w:rPr>
-              <w:t>Panchaati</w:t>
-            </w:r>
-            <w:proofErr w:type="spellEnd"/>
-            <w:r>
-              <w:rPr>
-                <w:rFonts w:cs="Latha"/>
-                <w:b/>
-                <w:bCs/>
-                <w:sz w:val="28"/>
-                <w:szCs w:val="28"/>
-                <w:lang w:bidi="ta-IN"/>
-              </w:rPr>
-              <w:t xml:space="preserve"> 3</w:t>
+            <w:r>
+              <w:rPr>
+                <w:rFonts w:cs="Latha"/>
+                <w:b/>
+                <w:bCs/>
+                <w:sz w:val="28"/>
+                <w:szCs w:val="28"/>
+                <w:lang w:bidi="ta-IN"/>
+              </w:rPr>
+              <w:t>Panchaati 3</w:t>
             </w:r>
           </w:p>
           <w:p>
@@ -13044,29 +13105,16 @@
                 <w:lang w:bidi="ta-IN"/>
               </w:rPr>
             </w:pPr>
-            <w:proofErr w:type="spellStart"/>
-            <w:r>
-              <w:rPr>
-                <w:rFonts w:cs="Latha"/>
-                <w:b/>
-                <w:bCs/>
-                <w:sz w:val="28"/>
-                <w:szCs w:val="28"/>
-                <w:lang w:bidi="ta-IN"/>
-              </w:rPr>
-              <w:t>Panchaati</w:t>
-            </w:r>
-            <w:proofErr w:type="spellEnd"/>
-            <w:r>
-              <w:rPr>
-                <w:rFonts w:cs="Latha"/>
-                <w:b/>
-                <w:bCs/>
-                <w:sz w:val="28"/>
-                <w:szCs w:val="28"/>
-                <w:lang w:bidi="ta-IN"/>
-              </w:rPr>
-              <w:t xml:space="preserve"> 3</w:t>
+            <w:r>
+              <w:rPr>
+                <w:rFonts w:cs="Latha"/>
+                <w:b/>
+                <w:bCs/>
+                <w:sz w:val="28"/>
+                <w:szCs w:val="28"/>
+                <w:lang w:bidi="ta-IN"/>
+              </w:rPr>
+              <w:t>Panchaati 3</w:t>
             </w:r>
           </w:p>
           <w:p>
@@ -13240,6 +13288,7 @@
                 <w:cs/>
                 <w:lang w:bidi="ta-IN"/>
               </w:rPr>
+              <w:lastRenderedPageBreak/>
               <w:t>ஜ</w:t>
             </w:r>
             <w:r>
@@ -13380,6 +13429,7 @@
                 <w:cs/>
                 <w:lang w:bidi="ta-IN"/>
               </w:rPr>
+              <w:lastRenderedPageBreak/>
               <w:t>வை</w:t>
             </w:r>
             <w:r>
@@ -13676,29 +13726,16 @@
                 <w:lang w:bidi="ta-IN"/>
               </w:rPr>
             </w:pPr>
-            <w:proofErr w:type="spellStart"/>
-            <w:r>
-              <w:rPr>
-                <w:rFonts w:cs="Latha"/>
-                <w:b/>
-                <w:bCs/>
-                <w:sz w:val="28"/>
-                <w:szCs w:val="28"/>
-                <w:lang w:bidi="ta-IN"/>
-              </w:rPr>
-              <w:t>Panchaati</w:t>
-            </w:r>
-            <w:proofErr w:type="spellEnd"/>
-            <w:r>
-              <w:rPr>
-                <w:rFonts w:cs="Latha"/>
-                <w:b/>
-                <w:bCs/>
-                <w:sz w:val="28"/>
-                <w:szCs w:val="28"/>
-                <w:lang w:bidi="ta-IN"/>
-              </w:rPr>
-              <w:t xml:space="preserve"> 10</w:t>
+            <w:r>
+              <w:rPr>
+                <w:rFonts w:cs="Latha"/>
+                <w:b/>
+                <w:bCs/>
+                <w:sz w:val="28"/>
+                <w:szCs w:val="28"/>
+                <w:lang w:bidi="ta-IN"/>
+              </w:rPr>
+              <w:t>Panchaati 10</w:t>
             </w:r>
           </w:p>
           <w:p>
@@ -13766,7 +13803,6 @@
               </w:rPr>
               <w:t>…</w:t>
             </w:r>
-            <w:proofErr w:type="spellStart"/>
             <w:r>
               <w:rPr>
                 <w:rFonts w:ascii="BRH Devanagari Extra" w:hAnsi="BRH Devanagari Extra" w:cs="Arial"/>
@@ -13776,7 +13812,6 @@
               </w:rPr>
               <w:t>óè</w:t>
             </w:r>
-            <w:proofErr w:type="spellEnd"/>
             <w:r>
               <w:rPr>
                 <w:rFonts w:ascii="BRH Tamil Tab Extra" w:hAnsi="BRH Tamil Tab Extra" w:cs="Arial"/>
@@ -13986,7 +14021,6 @@
               </w:rPr>
               <w:t>…</w:t>
             </w:r>
-            <w:proofErr w:type="spellStart"/>
             <w:r>
               <w:rPr>
                 <w:rFonts w:ascii="BRH Devanagari Extra" w:hAnsi="BRH Devanagari Extra" w:cs="Arial"/>
@@ -13996,7 +14030,6 @@
               </w:rPr>
               <w:t>óè</w:t>
             </w:r>
-            <w:proofErr w:type="spellEnd"/>
             <w:r>
               <w:rPr>
                 <w:rFonts w:ascii="BRH Tamil Tab Extra" w:hAnsi="BRH Tamil Tab Extra" w:cs="Arial"/>
@@ -14225,29 +14258,16 @@
                 <w:lang w:bidi="ta-IN"/>
               </w:rPr>
             </w:pPr>
-            <w:proofErr w:type="spellStart"/>
-            <w:r>
-              <w:rPr>
-                <w:rFonts w:cs="Latha"/>
-                <w:b/>
-                <w:bCs/>
-                <w:sz w:val="28"/>
-                <w:szCs w:val="28"/>
-                <w:lang w:bidi="ta-IN"/>
-              </w:rPr>
-              <w:t>Panchaati</w:t>
-            </w:r>
-            <w:proofErr w:type="spellEnd"/>
-            <w:r>
-              <w:rPr>
-                <w:rFonts w:cs="Latha"/>
-                <w:b/>
-                <w:bCs/>
-                <w:sz w:val="28"/>
-                <w:szCs w:val="28"/>
-                <w:lang w:bidi="ta-IN"/>
-              </w:rPr>
-              <w:t xml:space="preserve"> 15</w:t>
+            <w:r>
+              <w:rPr>
+                <w:rFonts w:cs="Latha"/>
+                <w:b/>
+                <w:bCs/>
+                <w:sz w:val="28"/>
+                <w:szCs w:val="28"/>
+                <w:lang w:bidi="ta-IN"/>
+              </w:rPr>
+              <w:t>Panchaati 15</w:t>
             </w:r>
           </w:p>
           <w:p>
@@ -14338,7 +14358,6 @@
               </w:rPr>
               <w:t>…</w:t>
             </w:r>
-            <w:proofErr w:type="spellStart"/>
             <w:r>
               <w:rPr>
                 <w:rFonts w:ascii="BRH Devanagari Extra" w:hAnsi="BRH Devanagari Extra" w:cs="Arial"/>
@@ -14348,7 +14367,6 @@
               </w:rPr>
               <w:t>óè</w:t>
             </w:r>
-            <w:proofErr w:type="spellEnd"/>
             <w:r>
               <w:rPr>
                 <w:rFonts w:ascii="BRH Tamil Tab Extra" w:hAnsi="BRH Tamil Tab Extra" w:cs="Arial"/>
@@ -14481,7 +14499,6 @@
               </w:rPr>
               <w:t>…</w:t>
             </w:r>
-            <w:proofErr w:type="spellStart"/>
             <w:r>
               <w:rPr>
                 <w:rFonts w:ascii="BRH Devanagari Extra" w:hAnsi="BRH Devanagari Extra" w:cs="Arial"/>
@@ -14491,7 +14508,6 @@
               </w:rPr>
               <w:t>óè</w:t>
             </w:r>
-            <w:proofErr w:type="spellEnd"/>
             <w:r>
               <w:rPr>
                 <w:rFonts w:ascii="BRH Tamil Tab Extra" w:hAnsi="BRH Tamil Tab Extra" w:cs="Arial"/>
@@ -14572,7 +14588,6 @@
               </w:rPr>
               <w:t>…</w:t>
             </w:r>
-            <w:proofErr w:type="spellStart"/>
             <w:r>
               <w:rPr>
                 <w:rFonts w:ascii="BRH Devanagari Extra" w:hAnsi="BRH Devanagari Extra" w:cs="Arial"/>
@@ -14582,7 +14597,6 @@
               </w:rPr>
               <w:t>óè</w:t>
             </w:r>
-            <w:proofErr w:type="spellEnd"/>
             <w:r>
               <w:rPr>
                 <w:rFonts w:ascii="BRH Tamil Tab Extra" w:hAnsi="BRH Tamil Tab Extra" w:cs="Arial"/>
@@ -14736,7 +14750,6 @@
               </w:rPr>
               <w:t>…</w:t>
             </w:r>
-            <w:proofErr w:type="spellStart"/>
             <w:r>
               <w:rPr>
                 <w:rFonts w:ascii="BRH Devanagari Extra" w:hAnsi="BRH Devanagari Extra" w:cs="Arial"/>
@@ -14746,7 +14759,6 @@
               </w:rPr>
               <w:t>óè</w:t>
             </w:r>
-            <w:proofErr w:type="spellEnd"/>
             <w:r>
               <w:rPr>
                 <w:rFonts w:ascii="BRH Tamil Tab Extra" w:hAnsi="BRH Tamil Tab Extra" w:cs="Arial"/>
@@ -14814,30 +14826,7 @@
                 <w:lang w:bidi="ta-IN"/>
               </w:rPr>
               <w:br/>
-            </w:r>
-            <w:proofErr w:type="spellStart"/>
-            <w:r>
-              <w:rPr>
-                <w:rFonts w:cs="Latha"/>
-                <w:b/>
-                <w:bCs/>
-                <w:sz w:val="28"/>
-                <w:szCs w:val="28"/>
-                <w:lang w:bidi="ta-IN"/>
-              </w:rPr>
-              <w:t>Panchaati</w:t>
-            </w:r>
-            <w:proofErr w:type="spellEnd"/>
-            <w:r>
-              <w:rPr>
-                <w:rFonts w:cs="Latha"/>
-                <w:b/>
-                <w:bCs/>
-                <w:sz w:val="28"/>
-                <w:szCs w:val="28"/>
-                <w:lang w:bidi="ta-IN"/>
-              </w:rPr>
-              <w:t xml:space="preserve"> 18 </w:t>
+              <w:t xml:space="preserve">Panchaati 18 </w:t>
             </w:r>
           </w:p>
           <w:p>
@@ -14927,7 +14916,6 @@
                 <w:szCs w:val="28"/>
                 <w:lang w:bidi="ta-IN"/>
               </w:rPr>
-              <w:lastRenderedPageBreak/>
               <w:t>Line 6</w:t>
             </w:r>
           </w:p>
@@ -14956,31 +14944,7 @@
                 <w:szCs w:val="28"/>
                 <w:lang w:bidi="ta-IN"/>
               </w:rPr>
-              <w:t>(</w:t>
-            </w:r>
-            <w:proofErr w:type="spellStart"/>
-            <w:r>
-              <w:rPr>
-                <w:rFonts w:cs="Latha"/>
-                <w:b/>
-                <w:bCs/>
-                <w:sz w:val="28"/>
-                <w:szCs w:val="28"/>
-                <w:lang w:bidi="ta-IN"/>
-              </w:rPr>
-              <w:t>Avagraha</w:t>
-            </w:r>
-            <w:proofErr w:type="spellEnd"/>
-            <w:r>
-              <w:rPr>
-                <w:rFonts w:cs="Latha"/>
-                <w:b/>
-                <w:bCs/>
-                <w:sz w:val="28"/>
-                <w:szCs w:val="28"/>
-                <w:lang w:bidi="ta-IN"/>
-              </w:rPr>
-              <w:t xml:space="preserve"> missed out)</w:t>
+              <w:t>(Avagraha missed out)</w:t>
             </w:r>
           </w:p>
         </w:tc>
@@ -15005,7 +14969,6 @@
                 <w:cs/>
                 <w:lang w:bidi="ta-IN"/>
               </w:rPr>
-              <w:lastRenderedPageBreak/>
               <w:t>ஸப்த</w:t>
             </w:r>
             <w:r>
@@ -15247,7 +15210,6 @@
                 <w:cs/>
                 <w:lang w:bidi="ta-IN"/>
               </w:rPr>
-              <w:lastRenderedPageBreak/>
               <w:t>பி</w:t>
             </w:r>
             <w:r>
@@ -15362,7 +15324,6 @@
                 <w:cs/>
                 <w:lang w:bidi="ta-IN"/>
               </w:rPr>
-              <w:lastRenderedPageBreak/>
               <w:t>ஸப்த</w:t>
             </w:r>
             <w:r>
@@ -15618,7 +15579,6 @@
                 <w:cs/>
                 <w:lang w:bidi="ta-IN"/>
               </w:rPr>
-              <w:lastRenderedPageBreak/>
               <w:t>பி</w:t>
             </w:r>
             <w:r>
@@ -15757,7 +15717,6 @@
                 <w:szCs w:val="28"/>
                 <w:lang w:bidi="ta-IN"/>
               </w:rPr>
-              <w:lastRenderedPageBreak/>
               <w:t>TS 4.3.11.2.</w:t>
             </w:r>
           </w:p>
@@ -15777,29 +15736,16 @@
                 <w:lang w:bidi="ta-IN"/>
               </w:rPr>
             </w:pPr>
-            <w:proofErr w:type="spellStart"/>
-            <w:r>
-              <w:rPr>
-                <w:rFonts w:cs="Latha"/>
-                <w:b/>
-                <w:bCs/>
-                <w:sz w:val="28"/>
-                <w:szCs w:val="28"/>
-                <w:lang w:bidi="ta-IN"/>
-              </w:rPr>
-              <w:t>Panchaati</w:t>
-            </w:r>
-            <w:proofErr w:type="spellEnd"/>
-            <w:r>
-              <w:rPr>
-                <w:rFonts w:cs="Latha"/>
-                <w:b/>
-                <w:bCs/>
-                <w:sz w:val="28"/>
-                <w:szCs w:val="28"/>
-                <w:lang w:bidi="ta-IN"/>
-              </w:rPr>
-              <w:t xml:space="preserve"> 22</w:t>
+            <w:r>
+              <w:rPr>
+                <w:rFonts w:cs="Latha"/>
+                <w:b/>
+                <w:bCs/>
+                <w:sz w:val="28"/>
+                <w:szCs w:val="28"/>
+                <w:lang w:bidi="ta-IN"/>
+              </w:rPr>
+              <w:t>Panchaati 22</w:t>
             </w:r>
           </w:p>
           <w:p>
@@ -16241,29 +16187,16 @@
                 <w:lang w:bidi="ta-IN"/>
               </w:rPr>
             </w:pPr>
-            <w:proofErr w:type="spellStart"/>
-            <w:r>
-              <w:rPr>
-                <w:rFonts w:cs="Latha"/>
-                <w:b/>
-                <w:bCs/>
-                <w:sz w:val="28"/>
-                <w:szCs w:val="28"/>
-                <w:lang w:bidi="ta-IN"/>
-              </w:rPr>
-              <w:t>Panchaati</w:t>
-            </w:r>
-            <w:proofErr w:type="spellEnd"/>
-            <w:r>
-              <w:rPr>
-                <w:rFonts w:cs="Latha"/>
-                <w:b/>
-                <w:bCs/>
-                <w:sz w:val="28"/>
-                <w:szCs w:val="28"/>
-                <w:lang w:bidi="ta-IN"/>
-              </w:rPr>
-              <w:t xml:space="preserve"> 4</w:t>
+            <w:r>
+              <w:rPr>
+                <w:rFonts w:cs="Latha"/>
+                <w:b/>
+                <w:bCs/>
+                <w:sz w:val="28"/>
+                <w:szCs w:val="28"/>
+                <w:lang w:bidi="ta-IN"/>
+              </w:rPr>
+              <w:t>Panchaati 4</w:t>
             </w:r>
           </w:p>
           <w:p>
@@ -16521,6 +16454,7 @@
                 <w:cs/>
                 <w:lang w:bidi="ta-IN"/>
               </w:rPr>
+              <w:lastRenderedPageBreak/>
               <w:t>ஸ்தப்</w:t>
             </w:r>
             <w:r>
@@ -16574,6 +16508,7 @@
                 <w:cs/>
                 <w:lang w:bidi="ta-IN"/>
               </w:rPr>
+              <w:lastRenderedPageBreak/>
               <w:t>ப்ர</w:t>
             </w:r>
             <w:r>
@@ -16832,29 +16767,16 @@
                 <w:lang w:bidi="ta-IN"/>
               </w:rPr>
             </w:pPr>
-            <w:proofErr w:type="spellStart"/>
-            <w:r>
-              <w:rPr>
-                <w:rFonts w:cs="Latha"/>
-                <w:b/>
-                <w:bCs/>
-                <w:sz w:val="28"/>
-                <w:szCs w:val="28"/>
-                <w:lang w:bidi="ta-IN"/>
-              </w:rPr>
-              <w:t>Panchaati</w:t>
-            </w:r>
-            <w:proofErr w:type="spellEnd"/>
-            <w:r>
-              <w:rPr>
-                <w:rFonts w:cs="Latha"/>
-                <w:b/>
-                <w:bCs/>
-                <w:sz w:val="28"/>
-                <w:szCs w:val="28"/>
-                <w:lang w:bidi="ta-IN"/>
-              </w:rPr>
-              <w:t xml:space="preserve"> 5</w:t>
+            <w:r>
+              <w:rPr>
+                <w:rFonts w:cs="Latha"/>
+                <w:b/>
+                <w:bCs/>
+                <w:sz w:val="28"/>
+                <w:szCs w:val="28"/>
+                <w:lang w:bidi="ta-IN"/>
+              </w:rPr>
+              <w:t>Panchaati 5</w:t>
             </w:r>
           </w:p>
           <w:p>
@@ -17365,29 +17287,16 @@
                 <w:lang w:bidi="ta-IN"/>
               </w:rPr>
             </w:pPr>
-            <w:proofErr w:type="spellStart"/>
-            <w:r>
-              <w:rPr>
-                <w:rFonts w:cs="Latha"/>
-                <w:b/>
-                <w:bCs/>
-                <w:sz w:val="28"/>
-                <w:szCs w:val="28"/>
-                <w:lang w:bidi="ta-IN"/>
-              </w:rPr>
-              <w:t>Panchaati</w:t>
-            </w:r>
-            <w:proofErr w:type="spellEnd"/>
-            <w:r>
-              <w:rPr>
-                <w:rFonts w:cs="Latha"/>
-                <w:b/>
-                <w:bCs/>
-                <w:sz w:val="28"/>
-                <w:szCs w:val="28"/>
-                <w:lang w:bidi="ta-IN"/>
-              </w:rPr>
-              <w:t xml:space="preserve"> 9</w:t>
+            <w:r>
+              <w:rPr>
+                <w:rFonts w:cs="Latha"/>
+                <w:b/>
+                <w:bCs/>
+                <w:sz w:val="28"/>
+                <w:szCs w:val="28"/>
+                <w:lang w:bidi="ta-IN"/>
+              </w:rPr>
+              <w:t>Panchaati 9</w:t>
             </w:r>
           </w:p>
           <w:p>
@@ -17950,29 +17859,16 @@
                 <w:lang w:bidi="ta-IN"/>
               </w:rPr>
             </w:pPr>
-            <w:proofErr w:type="spellStart"/>
-            <w:r>
-              <w:rPr>
-                <w:rFonts w:cs="Latha"/>
-                <w:b/>
-                <w:bCs/>
-                <w:sz w:val="28"/>
-                <w:szCs w:val="28"/>
-                <w:lang w:bidi="ta-IN"/>
-              </w:rPr>
-              <w:t>Panchaati</w:t>
-            </w:r>
-            <w:proofErr w:type="spellEnd"/>
-            <w:r>
-              <w:rPr>
-                <w:rFonts w:cs="Latha"/>
-                <w:b/>
-                <w:bCs/>
-                <w:sz w:val="28"/>
-                <w:szCs w:val="28"/>
-                <w:lang w:bidi="ta-IN"/>
-              </w:rPr>
-              <w:t xml:space="preserve"> 12</w:t>
+            <w:r>
+              <w:rPr>
+                <w:rFonts w:cs="Latha"/>
+                <w:b/>
+                <w:bCs/>
+                <w:sz w:val="28"/>
+                <w:szCs w:val="28"/>
+                <w:lang w:bidi="ta-IN"/>
+              </w:rPr>
+              <w:t>Panchaati 12</w:t>
             </w:r>
           </w:p>
           <w:p>
@@ -17991,7 +17887,6 @@
                 <w:lang w:bidi="ta-IN"/>
               </w:rPr>
             </w:pPr>
-            <w:proofErr w:type="gramStart"/>
             <w:r>
               <w:rPr>
                 <w:rFonts w:cs="Latha"/>
@@ -18003,7 +17898,6 @@
               </w:rPr>
               <w:t>Line  4</w:t>
             </w:r>
-            <w:proofErr w:type="gramEnd"/>
           </w:p>
         </w:tc>
         <w:tc>
@@ -18454,7 +18348,6 @@
                 <w:szCs w:val="28"/>
                 <w:lang w:bidi="ta-IN"/>
               </w:rPr>
-              <w:lastRenderedPageBreak/>
               <w:t>TS 4.4.8.1</w:t>
             </w:r>
           </w:p>
@@ -18474,29 +18367,16 @@
                 <w:lang w:bidi="ta-IN"/>
               </w:rPr>
             </w:pPr>
-            <w:proofErr w:type="spellStart"/>
-            <w:r>
-              <w:rPr>
-                <w:rFonts w:cs="Latha"/>
-                <w:b/>
-                <w:bCs/>
-                <w:sz w:val="28"/>
-                <w:szCs w:val="28"/>
-                <w:lang w:bidi="ta-IN"/>
-              </w:rPr>
-              <w:t>Panchaati</w:t>
-            </w:r>
-            <w:proofErr w:type="spellEnd"/>
-            <w:r>
-              <w:rPr>
-                <w:rFonts w:cs="Latha"/>
-                <w:b/>
-                <w:bCs/>
-                <w:sz w:val="28"/>
-                <w:szCs w:val="28"/>
-                <w:lang w:bidi="ta-IN"/>
-              </w:rPr>
-              <w:t xml:space="preserve"> 24</w:t>
+            <w:r>
+              <w:rPr>
+                <w:rFonts w:cs="Latha"/>
+                <w:b/>
+                <w:bCs/>
+                <w:sz w:val="28"/>
+                <w:szCs w:val="28"/>
+                <w:lang w:bidi="ta-IN"/>
+              </w:rPr>
+              <w:t>Panchaati 24</w:t>
             </w:r>
           </w:p>
           <w:p>
@@ -19120,29 +19000,16 @@
                 <w:lang w:bidi="ta-IN"/>
               </w:rPr>
             </w:pPr>
-            <w:proofErr w:type="spellStart"/>
-            <w:r>
-              <w:rPr>
-                <w:rFonts w:cs="Latha"/>
-                <w:b/>
-                <w:bCs/>
-                <w:sz w:val="28"/>
-                <w:szCs w:val="28"/>
-                <w:lang w:bidi="ta-IN"/>
-              </w:rPr>
-              <w:t>Panchaati</w:t>
-            </w:r>
-            <w:proofErr w:type="spellEnd"/>
-            <w:r>
-              <w:rPr>
-                <w:rFonts w:cs="Latha"/>
-                <w:b/>
-                <w:bCs/>
-                <w:sz w:val="28"/>
-                <w:szCs w:val="28"/>
-                <w:lang w:bidi="ta-IN"/>
-              </w:rPr>
-              <w:t xml:space="preserve"> 27</w:t>
+            <w:r>
+              <w:rPr>
+                <w:rFonts w:cs="Latha"/>
+                <w:b/>
+                <w:bCs/>
+                <w:sz w:val="28"/>
+                <w:szCs w:val="28"/>
+                <w:lang w:bidi="ta-IN"/>
+              </w:rPr>
+              <w:t>Panchaati 27</w:t>
             </w:r>
           </w:p>
           <w:p>
@@ -19250,7 +19117,6 @@
               </w:rPr>
               <w:t>†</w:t>
             </w:r>
-            <w:proofErr w:type="spellStart"/>
             <w:r>
               <w:rPr>
                 <w:rFonts w:ascii="BRH Devanagari Extra" w:hAnsi="BRH Devanagari Extra" w:cs="Latha"/>
@@ -19260,7 +19126,6 @@
               </w:rPr>
               <w:t>óè</w:t>
             </w:r>
-            <w:proofErr w:type="spellEnd"/>
             <w:r>
               <w:rPr>
                 <w:rFonts w:ascii="Latha" w:hAnsi="Latha" w:cs="Latha"/>
@@ -19385,7 +19250,6 @@
               </w:rPr>
               <w:t>த்ர</w:t>
             </w:r>
-            <w:proofErr w:type="spellStart"/>
             <w:r>
               <w:rPr>
                 <w:rFonts w:ascii="BRH Devanagari Extra" w:hAnsi="BRH Devanagari Extra" w:cs="Latha"/>
@@ -19395,7 +19259,6 @@
               </w:rPr>
               <w:t>óè</w:t>
             </w:r>
-            <w:proofErr w:type="spellEnd"/>
             <w:r>
               <w:rPr>
                 <w:rFonts w:ascii="Latha" w:hAnsi="Latha" w:cs="Latha"/>
@@ -19463,6 +19326,7 @@
                 <w:szCs w:val="28"/>
                 <w:lang w:bidi="ta-IN"/>
               </w:rPr>
+              <w:lastRenderedPageBreak/>
               <w:t>TS 4.</w:t>
             </w:r>
             <w:r>
@@ -19523,29 +19387,7 @@
                 <w:szCs w:val="28"/>
                 <w:lang w:bidi="ta-IN"/>
               </w:rPr>
-              <w:t xml:space="preserve"> - </w:t>
-            </w:r>
-            <w:proofErr w:type="spellStart"/>
-            <w:r>
-              <w:rPr>
-                <w:rFonts w:cs="Latha"/>
-                <w:b/>
-                <w:sz w:val="28"/>
-                <w:szCs w:val="28"/>
-                <w:lang w:bidi="ta-IN"/>
-              </w:rPr>
-              <w:t>Vaakyam</w:t>
-            </w:r>
-            <w:proofErr w:type="spellEnd"/>
-            <w:r>
-              <w:rPr>
-                <w:rFonts w:cs="Latha"/>
-                <w:b/>
-                <w:sz w:val="28"/>
-                <w:szCs w:val="28"/>
-                <w:lang w:bidi="ta-IN"/>
-              </w:rPr>
-              <w:t xml:space="preserve"> </w:t>
+              <w:t xml:space="preserve"> - Vaakyam </w:t>
             </w:r>
           </w:p>
           <w:p>
@@ -19590,27 +19432,15 @@
                 <w:lang w:bidi="ta-IN"/>
               </w:rPr>
             </w:pPr>
-            <w:proofErr w:type="spellStart"/>
-            <w:r>
-              <w:rPr>
-                <w:rFonts w:cs="Latha"/>
-                <w:b/>
-                <w:sz w:val="28"/>
-                <w:szCs w:val="28"/>
-                <w:lang w:bidi="ta-IN"/>
-              </w:rPr>
-              <w:t>Panchaati</w:t>
-            </w:r>
-            <w:proofErr w:type="spellEnd"/>
-            <w:r>
-              <w:rPr>
-                <w:rFonts w:cs="Latha"/>
-                <w:b/>
-                <w:sz w:val="28"/>
-                <w:szCs w:val="28"/>
-                <w:lang w:bidi="ta-IN"/>
-              </w:rPr>
-              <w:t xml:space="preserve"> No. - </w:t>
+            <w:r>
+              <w:rPr>
+                <w:rFonts w:cs="Latha"/>
+                <w:b/>
+                <w:sz w:val="28"/>
+                <w:szCs w:val="28"/>
+                <w:lang w:bidi="ta-IN"/>
+              </w:rPr>
+              <w:t xml:space="preserve">Panchaati No. - </w:t>
             </w:r>
             <w:r>
               <w:rPr>
@@ -20094,27 +19924,15 @@
                 <w:lang w:bidi="ta-IN"/>
               </w:rPr>
             </w:pPr>
-            <w:proofErr w:type="spellStart"/>
-            <w:r>
-              <w:rPr>
-                <w:rFonts w:cs="Latha"/>
-                <w:b/>
-                <w:sz w:val="28"/>
-                <w:szCs w:val="28"/>
-                <w:lang w:bidi="ta-IN"/>
-              </w:rPr>
-              <w:t>Panchaati</w:t>
-            </w:r>
-            <w:proofErr w:type="spellEnd"/>
-            <w:r>
-              <w:rPr>
-                <w:rFonts w:cs="Latha"/>
-                <w:b/>
-                <w:sz w:val="28"/>
-                <w:szCs w:val="28"/>
-                <w:lang w:bidi="ta-IN"/>
-              </w:rPr>
-              <w:t xml:space="preserve"> No. - </w:t>
+            <w:r>
+              <w:rPr>
+                <w:rFonts w:cs="Latha"/>
+                <w:b/>
+                <w:sz w:val="28"/>
+                <w:szCs w:val="28"/>
+                <w:lang w:bidi="ta-IN"/>
+              </w:rPr>
+              <w:t xml:space="preserve">Panchaati No. - </w:t>
             </w:r>
             <w:r>
               <w:rPr>
@@ -20661,7 +20479,6 @@
               </w:rPr>
               <w:t>“</w:t>
             </w:r>
-            <w:proofErr w:type="gramStart"/>
             <w:r>
               <w:rPr>
                 <w:rFonts w:ascii="Latha" w:hAnsi="Latha" w:cs="Latha"/>
@@ -20688,7 +20505,6 @@
               </w:rPr>
               <w:t>deleted</w:t>
             </w:r>
-            <w:proofErr w:type="gramEnd"/>
             <w:r>
               <w:rPr>
                 <w:rFonts w:cs="Arial"/>
@@ -20823,27 +20639,15 @@
                 <w:lang w:bidi="ta-IN"/>
               </w:rPr>
             </w:pPr>
-            <w:proofErr w:type="spellStart"/>
-            <w:r>
-              <w:rPr>
-                <w:rFonts w:cs="Latha"/>
-                <w:b/>
-                <w:sz w:val="28"/>
-                <w:szCs w:val="28"/>
-                <w:lang w:bidi="ta-IN"/>
-              </w:rPr>
-              <w:t>Panchaati</w:t>
-            </w:r>
-            <w:proofErr w:type="spellEnd"/>
-            <w:r>
-              <w:rPr>
-                <w:rFonts w:cs="Latha"/>
-                <w:b/>
-                <w:sz w:val="28"/>
-                <w:szCs w:val="28"/>
-                <w:lang w:bidi="ta-IN"/>
-              </w:rPr>
-              <w:t xml:space="preserve"> No. - </w:t>
+            <w:r>
+              <w:rPr>
+                <w:rFonts w:cs="Latha"/>
+                <w:b/>
+                <w:sz w:val="28"/>
+                <w:szCs w:val="28"/>
+                <w:lang w:bidi="ta-IN"/>
+              </w:rPr>
+              <w:t xml:space="preserve">Panchaati No. - </w:t>
             </w:r>
             <w:r>
               <w:rPr>
@@ -21261,7 +21065,6 @@
         </w:rPr>
         <w:br w:type="page"/>
       </w:r>
-      <w:proofErr w:type="spellStart"/>
       <w:r>
         <w:rPr>
           <w:b/>
@@ -21271,18 +21074,7 @@
           <w:u w:val="single"/>
         </w:rPr>
         <w:lastRenderedPageBreak/>
-        <w:t>TaittirIya</w:t>
-      </w:r>
-      <w:proofErr w:type="spellEnd"/>
-      <w:r>
-        <w:rPr>
-          <w:b/>
-          <w:bCs/>
-          <w:sz w:val="32"/>
-          <w:szCs w:val="32"/>
-          <w:u w:val="single"/>
-        </w:rPr>
-        <w:t xml:space="preserve"> Samhita –</w:t>
+        <w:t>TaittirIya Samhita –</w:t>
       </w:r>
       <w:r>
         <w:rPr>
@@ -21568,21 +21360,8 @@
                 <w:szCs w:val="28"/>
                 <w:lang w:bidi="ta-IN"/>
               </w:rPr>
-              <w:t xml:space="preserve"> </w:t>
-            </w:r>
-            <w:proofErr w:type="spellStart"/>
-            <w:r>
-              <w:rPr>
-                <w:rFonts w:cs="Latha"/>
-                <w:b/>
-                <w:bCs/>
-                <w:sz w:val="28"/>
-                <w:szCs w:val="28"/>
-                <w:lang w:bidi="ta-IN"/>
-              </w:rPr>
-              <w:t>Vaakyam</w:t>
-            </w:r>
-            <w:proofErr w:type="spellEnd"/>
+              <w:t xml:space="preserve"> Vaakyam</w:t>
+            </w:r>
           </w:p>
           <w:p>
             <w:pPr>
@@ -21632,21 +21411,8 @@
                 <w:szCs w:val="28"/>
                 <w:lang w:bidi="ta-IN"/>
               </w:rPr>
-              <w:t xml:space="preserve"> </w:t>
-            </w:r>
-            <w:proofErr w:type="spellStart"/>
-            <w:r>
-              <w:rPr>
-                <w:rFonts w:cs="Latha"/>
-                <w:b/>
-                <w:bCs/>
-                <w:sz w:val="28"/>
-                <w:szCs w:val="28"/>
-                <w:lang w:bidi="ta-IN"/>
-              </w:rPr>
-              <w:t>Panchaati</w:t>
-            </w:r>
-            <w:proofErr w:type="spellEnd"/>
+              <w:t xml:space="preserve"> Panchaati</w:t>
+            </w:r>
           </w:p>
         </w:tc>
         <w:tc>
@@ -22085,25 +21851,7 @@
                 <w:sz w:val="32"/>
                 <w:szCs w:val="32"/>
               </w:rPr>
-              <w:t xml:space="preserve">” , </w:t>
-            </w:r>
-            <w:proofErr w:type="spellStart"/>
-            <w:r>
-              <w:rPr>
-                <w:rFonts w:cs="Arial"/>
-                <w:sz w:val="32"/>
-                <w:szCs w:val="32"/>
-              </w:rPr>
-              <w:t>insteas</w:t>
-            </w:r>
-            <w:proofErr w:type="spellEnd"/>
-            <w:r>
-              <w:rPr>
-                <w:rFonts w:cs="Arial"/>
-                <w:sz w:val="32"/>
-                <w:szCs w:val="32"/>
-              </w:rPr>
-              <w:t xml:space="preserve"> of two</w:t>
+              <w:t>” , insteas of two</w:t>
             </w:r>
             <w:r>
               <w:rPr>
@@ -22171,31 +21919,7 @@
                 <w:szCs w:val="28"/>
                 <w:lang w:bidi="ta-IN"/>
               </w:rPr>
-              <w:t xml:space="preserve">TS 4.2.3.3 - </w:t>
-            </w:r>
-            <w:proofErr w:type="spellStart"/>
-            <w:r>
-              <w:rPr>
-                <w:rFonts w:cs="Latha"/>
-                <w:b/>
-                <w:bCs/>
-                <w:sz w:val="28"/>
-                <w:szCs w:val="28"/>
-                <w:lang w:bidi="ta-IN"/>
-              </w:rPr>
-              <w:t>Vaakyam</w:t>
-            </w:r>
-            <w:proofErr w:type="spellEnd"/>
-            <w:r>
-              <w:rPr>
-                <w:rFonts w:cs="Latha"/>
-                <w:b/>
-                <w:bCs/>
-                <w:sz w:val="28"/>
-                <w:szCs w:val="28"/>
-                <w:lang w:bidi="ta-IN"/>
-              </w:rPr>
-              <w:t xml:space="preserve"> </w:t>
+              <w:t xml:space="preserve">TS 4.2.3.3 - Vaakyam </w:t>
             </w:r>
           </w:p>
           <w:p>
@@ -22220,21 +21944,8 @@
                 <w:szCs w:val="28"/>
                 <w:lang w:bidi="ta-IN"/>
               </w:rPr>
-              <w:t xml:space="preserve">12th </w:t>
-            </w:r>
-            <w:proofErr w:type="spellStart"/>
-            <w:r>
-              <w:rPr>
-                <w:rFonts w:cs="Latha"/>
-                <w:b/>
-                <w:bCs/>
-                <w:sz w:val="28"/>
-                <w:szCs w:val="28"/>
-                <w:lang w:bidi="ta-IN"/>
-              </w:rPr>
-              <w:t>Panchaati</w:t>
-            </w:r>
-            <w:proofErr w:type="spellEnd"/>
+              <w:t>12th Panchaati</w:t>
+            </w:r>
           </w:p>
         </w:tc>
         <w:tc>
@@ -22681,31 +22392,7 @@
                 <w:szCs w:val="28"/>
                 <w:lang w:bidi="ta-IN"/>
               </w:rPr>
-              <w:t xml:space="preserve">TS 4.2.4.4 - </w:t>
-            </w:r>
-            <w:proofErr w:type="spellStart"/>
-            <w:r>
-              <w:rPr>
-                <w:rFonts w:cs="Latha"/>
-                <w:b/>
-                <w:bCs/>
-                <w:sz w:val="28"/>
-                <w:szCs w:val="28"/>
-                <w:lang w:bidi="ta-IN"/>
-              </w:rPr>
-              <w:t>Vaakyam</w:t>
-            </w:r>
-            <w:proofErr w:type="spellEnd"/>
-            <w:r>
-              <w:rPr>
-                <w:rFonts w:cs="Latha"/>
-                <w:b/>
-                <w:bCs/>
-                <w:sz w:val="28"/>
-                <w:szCs w:val="28"/>
-                <w:lang w:bidi="ta-IN"/>
-              </w:rPr>
-              <w:t xml:space="preserve"> </w:t>
+              <w:t xml:space="preserve">TS 4.2.4.4 - Vaakyam </w:t>
             </w:r>
           </w:p>
           <w:p>
@@ -22730,21 +22417,8 @@
                 <w:szCs w:val="28"/>
                 <w:lang w:bidi="ta-IN"/>
               </w:rPr>
-              <w:t xml:space="preserve">17th </w:t>
-            </w:r>
-            <w:proofErr w:type="spellStart"/>
-            <w:r>
-              <w:rPr>
-                <w:rFonts w:cs="Latha"/>
-                <w:b/>
-                <w:bCs/>
-                <w:sz w:val="28"/>
-                <w:szCs w:val="28"/>
-                <w:lang w:bidi="ta-IN"/>
-              </w:rPr>
-              <w:t>Panchaati</w:t>
-            </w:r>
-            <w:proofErr w:type="spellEnd"/>
+              <w:t>17th Panchaati</w:t>
+            </w:r>
           </w:p>
         </w:tc>
         <w:tc>
@@ -23169,25 +22843,7 @@
                 <w:sz w:val="32"/>
                 <w:szCs w:val="32"/>
               </w:rPr>
-              <w:t xml:space="preserve">lower </w:t>
-            </w:r>
-            <w:proofErr w:type="spellStart"/>
-            <w:r>
-              <w:rPr>
-                <w:rFonts w:cs="Arial"/>
-                <w:sz w:val="32"/>
-                <w:szCs w:val="32"/>
-              </w:rPr>
-              <w:t>swaram</w:t>
-            </w:r>
-            <w:proofErr w:type="spellEnd"/>
-            <w:r>
-              <w:rPr>
-                <w:rFonts w:cs="Arial"/>
-                <w:sz w:val="32"/>
-                <w:szCs w:val="32"/>
-              </w:rPr>
-              <w:t xml:space="preserve"> removed)</w:t>
+              <w:t>lower swaram removed)</w:t>
             </w:r>
           </w:p>
         </w:tc>
@@ -23229,31 +22885,7 @@
                 <w:szCs w:val="28"/>
                 <w:lang w:bidi="ta-IN"/>
               </w:rPr>
-              <w:t xml:space="preserve">TS 4.2.5.2 - </w:t>
-            </w:r>
-            <w:proofErr w:type="spellStart"/>
-            <w:r>
-              <w:rPr>
-                <w:rFonts w:cs="Latha"/>
-                <w:b/>
-                <w:bCs/>
-                <w:sz w:val="28"/>
-                <w:szCs w:val="28"/>
-                <w:lang w:bidi="ta-IN"/>
-              </w:rPr>
-              <w:t>Vaakyam</w:t>
-            </w:r>
-            <w:proofErr w:type="spellEnd"/>
-            <w:r>
-              <w:rPr>
-                <w:rFonts w:cs="Latha"/>
-                <w:b/>
-                <w:bCs/>
-                <w:sz w:val="28"/>
-                <w:szCs w:val="28"/>
-                <w:lang w:bidi="ta-IN"/>
-              </w:rPr>
-              <w:t xml:space="preserve"> </w:t>
+              <w:t xml:space="preserve">TS 4.2.5.2 - Vaakyam </w:t>
             </w:r>
           </w:p>
           <w:p>
@@ -23278,21 +22910,8 @@
                 <w:szCs w:val="28"/>
                 <w:lang w:bidi="ta-IN"/>
               </w:rPr>
-              <w:t xml:space="preserve">19th </w:t>
-            </w:r>
-            <w:proofErr w:type="spellStart"/>
-            <w:r>
-              <w:rPr>
-                <w:rFonts w:cs="Latha"/>
-                <w:b/>
-                <w:bCs/>
-                <w:sz w:val="28"/>
-                <w:szCs w:val="28"/>
-                <w:lang w:bidi="ta-IN"/>
-              </w:rPr>
-              <w:t>Panchaati</w:t>
-            </w:r>
-            <w:proofErr w:type="spellEnd"/>
+              <w:t>19th Panchaati</w:t>
+            </w:r>
           </w:p>
         </w:tc>
         <w:tc>
@@ -23497,6 +23116,7 @@
                 <w:szCs w:val="28"/>
                 <w:lang w:bidi="ta-IN"/>
               </w:rPr>
+              <w:lastRenderedPageBreak/>
               <w:t>4.3.10.2-Vaakyam</w:t>
             </w:r>
           </w:p>
@@ -23542,21 +23162,8 @@
                 <w:szCs w:val="28"/>
                 <w:lang w:bidi="ta-IN"/>
               </w:rPr>
-              <w:t xml:space="preserve"> </w:t>
-            </w:r>
-            <w:proofErr w:type="spellStart"/>
-            <w:r>
-              <w:rPr>
-                <w:rFonts w:cs="Arial"/>
-                <w:b/>
-                <w:bCs/>
-                <w:sz w:val="28"/>
-                <w:szCs w:val="28"/>
-                <w:lang w:bidi="ta-IN"/>
-              </w:rPr>
-              <w:t>Panchaati</w:t>
-            </w:r>
-            <w:proofErr w:type="spellEnd"/>
+              <w:t xml:space="preserve"> Panchaati</w:t>
+            </w:r>
           </w:p>
         </w:tc>
         <w:tc>
@@ -23993,20 +23600,8 @@
                 <w:sz w:val="28"/>
                 <w:szCs w:val="28"/>
               </w:rPr>
-              <w:lastRenderedPageBreak/>
-              <w:t xml:space="preserve">TS 4.4.3.1 - </w:t>
-            </w:r>
-            <w:proofErr w:type="spellStart"/>
-            <w:r>
-              <w:rPr>
-                <w:b/>
-                <w:bCs/>
-                <w:sz w:val="28"/>
-                <w:szCs w:val="28"/>
-              </w:rPr>
-              <w:t>Vaakyam</w:t>
-            </w:r>
-            <w:proofErr w:type="spellEnd"/>
+              <w:t>TS 4.4.3.1 - Vaakyam</w:t>
+            </w:r>
           </w:p>
           <w:p>
             <w:pPr>
@@ -24460,19 +24055,8 @@
                 <w:sz w:val="28"/>
                 <w:szCs w:val="28"/>
               </w:rPr>
-              <w:t xml:space="preserve">TS 4.4.3.2 - </w:t>
-            </w:r>
-            <w:proofErr w:type="spellStart"/>
-            <w:r>
-              <w:rPr>
-                <w:b/>
-                <w:bCs/>
-                <w:sz w:val="28"/>
-                <w:szCs w:val="28"/>
-              </w:rPr>
-              <w:t>Vaakyam</w:t>
-            </w:r>
-            <w:proofErr w:type="spellEnd"/>
+              <w:t>TS 4.4.3.2 - Vaakyam</w:t>
+            </w:r>
           </w:p>
           <w:p>
             <w:pPr>
@@ -24965,19 +24549,8 @@
                 <w:sz w:val="28"/>
                 <w:szCs w:val="28"/>
               </w:rPr>
-              <w:t xml:space="preserve">TS 4.4.4.1 - </w:t>
-            </w:r>
-            <w:proofErr w:type="spellStart"/>
-            <w:r>
-              <w:rPr>
-                <w:b/>
-                <w:bCs/>
-                <w:sz w:val="28"/>
-                <w:szCs w:val="28"/>
-              </w:rPr>
-              <w:t>Vaakyam</w:t>
-            </w:r>
-            <w:proofErr w:type="spellEnd"/>
+              <w:t>TS 4.4.4.1 - Vaakyam</w:t>
+            </w:r>
           </w:p>
           <w:p>
             <w:pPr>
@@ -25529,23 +25102,7 @@
                 <w:sz w:val="28"/>
                 <w:szCs w:val="28"/>
               </w:rPr>
-              <w:t xml:space="preserve">No </w:t>
-            </w:r>
-            <w:proofErr w:type="spellStart"/>
-            <w:r>
-              <w:rPr>
-                <w:sz w:val="28"/>
-                <w:szCs w:val="28"/>
-              </w:rPr>
-              <w:t>vaakyam</w:t>
-            </w:r>
-            <w:proofErr w:type="spellEnd"/>
-            <w:r>
-              <w:rPr>
-                <w:sz w:val="28"/>
-                <w:szCs w:val="28"/>
-              </w:rPr>
-              <w:t xml:space="preserve"> corrections</w:t>
+              <w:t>No vaakyam corrections</w:t>
             </w:r>
           </w:p>
         </w:tc>
@@ -25573,23 +25130,7 @@
                 <w:sz w:val="28"/>
                 <w:szCs w:val="28"/>
               </w:rPr>
-              <w:t xml:space="preserve">No </w:t>
-            </w:r>
-            <w:proofErr w:type="spellStart"/>
-            <w:r>
-              <w:rPr>
-                <w:sz w:val="28"/>
-                <w:szCs w:val="28"/>
-              </w:rPr>
-              <w:t>vaakyam</w:t>
-            </w:r>
-            <w:proofErr w:type="spellEnd"/>
-            <w:r>
-              <w:rPr>
-                <w:sz w:val="28"/>
-                <w:szCs w:val="28"/>
-              </w:rPr>
-              <w:t xml:space="preserve"> corrections |</w:t>
+              <w:t>No vaakyam corrections |</w:t>
             </w:r>
           </w:p>
         </w:tc>
@@ -25633,21 +25174,8 @@
                 <w:szCs w:val="28"/>
                 <w:lang w:bidi="ta-IN"/>
               </w:rPr>
-              <w:t xml:space="preserve">4.6.4.1 – </w:t>
-            </w:r>
-            <w:proofErr w:type="spellStart"/>
-            <w:r>
-              <w:rPr>
-                <w:rFonts w:cs="Arial"/>
-                <w:b/>
-                <w:bCs/>
-                <w:sz w:val="28"/>
-                <w:szCs w:val="28"/>
-                <w:lang w:bidi="ta-IN"/>
-              </w:rPr>
-              <w:t>Vaakyam</w:t>
-            </w:r>
-            <w:proofErr w:type="spellEnd"/>
+              <w:t>4.6.4.1 – Vaakyam</w:t>
+            </w:r>
           </w:p>
           <w:p>
             <w:pPr>
@@ -25683,21 +25211,8 @@
                 <w:szCs w:val="28"/>
                 <w:lang w:bidi="ta-IN"/>
               </w:rPr>
-              <w:t xml:space="preserve"> </w:t>
-            </w:r>
-            <w:proofErr w:type="spellStart"/>
-            <w:r>
-              <w:rPr>
-                <w:rFonts w:cs="Arial"/>
-                <w:b/>
-                <w:bCs/>
-                <w:sz w:val="28"/>
-                <w:szCs w:val="28"/>
-                <w:lang w:bidi="ta-IN"/>
-              </w:rPr>
-              <w:t>Panchaati</w:t>
-            </w:r>
-            <w:proofErr w:type="spellEnd"/>
+              <w:t xml:space="preserve"> Panchaati</w:t>
+            </w:r>
           </w:p>
         </w:tc>
         <w:tc>
@@ -26155,21 +25670,8 @@
                 <w:szCs w:val="28"/>
                 <w:lang w:bidi="ta-IN"/>
               </w:rPr>
-              <w:t xml:space="preserve">4.6.5.1 – </w:t>
-            </w:r>
-            <w:proofErr w:type="spellStart"/>
-            <w:r>
-              <w:rPr>
-                <w:rFonts w:cs="Arial"/>
-                <w:b/>
-                <w:bCs/>
-                <w:sz w:val="28"/>
-                <w:szCs w:val="28"/>
-                <w:lang w:bidi="ta-IN"/>
-              </w:rPr>
-              <w:t>Vaakyam</w:t>
-            </w:r>
-            <w:proofErr w:type="spellEnd"/>
+              <w:t>4.6.5.1 – Vaakyam</w:t>
+            </w:r>
           </w:p>
           <w:p>
             <w:pPr>
@@ -26193,21 +25695,8 @@
                 <w:szCs w:val="28"/>
                 <w:lang w:bidi="ta-IN"/>
               </w:rPr>
-              <w:t xml:space="preserve">21st </w:t>
-            </w:r>
-            <w:proofErr w:type="spellStart"/>
-            <w:r>
-              <w:rPr>
-                <w:rFonts w:cs="Arial"/>
-                <w:b/>
-                <w:bCs/>
-                <w:sz w:val="28"/>
-                <w:szCs w:val="28"/>
-                <w:lang w:bidi="ta-IN"/>
-              </w:rPr>
-              <w:t>Panchaati</w:t>
-            </w:r>
-            <w:proofErr w:type="spellEnd"/>
+              <w:t>21st Panchaati</w:t>
+            </w:r>
           </w:p>
           <w:p>
             <w:pPr>
@@ -26388,7 +25877,6 @@
               </w:rPr>
               <w:t xml:space="preserve"> </w:t>
             </w:r>
-            <w:proofErr w:type="spellStart"/>
             <w:r>
               <w:rPr>
                 <w:rFonts w:ascii="BRH Devanagari Extra" w:hAnsi="BRH Devanagari Extra" w:cs="BRH Devanagari Extra"/>
@@ -26397,7 +25885,6 @@
               </w:rPr>
               <w:t>ûþ</w:t>
             </w:r>
-            <w:proofErr w:type="spellEnd"/>
           </w:p>
         </w:tc>
         <w:tc>
@@ -26579,9 +26066,9 @@
                 <w:szCs w:val="32"/>
                 <w:lang w:bidi="ta-IN"/>
               </w:rPr>
-              <w:t xml:space="preserve">(it is </w:t>
-            </w:r>
-            <w:proofErr w:type="spellStart"/>
+              <w:lastRenderedPageBreak/>
+              <w:t>(it is hras</w:t>
+            </w:r>
             <w:r>
               <w:rPr>
                 <w:rFonts w:ascii="Latha" w:hAnsi="Latha" w:cs="Latha"/>
@@ -26589,7 +26076,7 @@
                 <w:szCs w:val="32"/>
                 <w:lang w:bidi="ta-IN"/>
               </w:rPr>
-              <w:t>hras</w:t>
+              <w:t>wa</w:t>
             </w:r>
             <w:r>
               <w:rPr>
@@ -26598,26 +26085,7 @@
                 <w:szCs w:val="32"/>
                 <w:lang w:bidi="ta-IN"/>
               </w:rPr>
-              <w:t>wa</w:t>
-            </w:r>
-            <w:r>
-              <w:rPr>
-                <w:rFonts w:ascii="Latha" w:hAnsi="Latha" w:cs="Latha"/>
-                <w:sz w:val="32"/>
-                <w:szCs w:val="32"/>
-                <w:lang w:bidi="ta-IN"/>
-              </w:rPr>
-              <w:t>m</w:t>
-            </w:r>
-            <w:proofErr w:type="spellEnd"/>
-            <w:r>
-              <w:rPr>
-                <w:rFonts w:ascii="Latha" w:hAnsi="Latha" w:cs="Latha"/>
-                <w:sz w:val="32"/>
-                <w:szCs w:val="32"/>
-                <w:lang w:bidi="ta-IN"/>
-              </w:rPr>
-              <w:t>)</w:t>
+              <w:t>m)</w:t>
             </w:r>
             <w:r>
               <w:rPr>
@@ -26671,19 +26139,8 @@
                 <w:szCs w:val="28"/>
               </w:rPr>
               <w:lastRenderedPageBreak/>
-              <w:t xml:space="preserve">4.7.4.1 - </w:t>
-            </w:r>
-            <w:proofErr w:type="spellStart"/>
-            <w:r>
-              <w:rPr>
-                <w:b/>
-                <w:bCs/>
-                <w:sz w:val="28"/>
-                <w:szCs w:val="28"/>
-              </w:rPr>
-              <w:t>Vaakyam</w:t>
-            </w:r>
-            <w:proofErr w:type="spellEnd"/>
+              <w:t>4.7.4.1 - Vaakyam</w:t>
+            </w:r>
           </w:p>
           <w:p>
             <w:pPr>
@@ -26707,19 +26164,8 @@
                 <w:sz w:val="28"/>
                 <w:szCs w:val="28"/>
               </w:rPr>
-              <w:t xml:space="preserve">7th </w:t>
-            </w:r>
-            <w:proofErr w:type="spellStart"/>
-            <w:r>
-              <w:rPr>
-                <w:b/>
-                <w:bCs/>
-                <w:sz w:val="28"/>
-                <w:szCs w:val="28"/>
-              </w:rPr>
-              <w:t>Panchaati</w:t>
-            </w:r>
-            <w:proofErr w:type="spellEnd"/>
+              <w:t>7th Panchaati</w:t>
+            </w:r>
           </w:p>
         </w:tc>
         <w:tc>
@@ -27095,19 +26541,8 @@
                 <w:sz w:val="28"/>
                 <w:szCs w:val="28"/>
               </w:rPr>
-              <w:t xml:space="preserve">4.7.10.1 - </w:t>
-            </w:r>
-            <w:proofErr w:type="spellStart"/>
-            <w:r>
-              <w:rPr>
-                <w:b/>
-                <w:bCs/>
-                <w:sz w:val="28"/>
-                <w:szCs w:val="28"/>
-              </w:rPr>
-              <w:t>Vaakyam</w:t>
-            </w:r>
-            <w:proofErr w:type="spellEnd"/>
+              <w:t>4.7.10.1 - Vaakyam</w:t>
+            </w:r>
           </w:p>
           <w:p>
             <w:pPr>
@@ -27131,19 +26566,8 @@
                 <w:sz w:val="28"/>
                 <w:szCs w:val="28"/>
               </w:rPr>
-              <w:t xml:space="preserve">17th </w:t>
-            </w:r>
-            <w:proofErr w:type="spellStart"/>
-            <w:r>
-              <w:rPr>
-                <w:b/>
-                <w:bCs/>
-                <w:sz w:val="28"/>
-                <w:szCs w:val="28"/>
-              </w:rPr>
-              <w:t>Panchaati</w:t>
-            </w:r>
-            <w:proofErr w:type="spellEnd"/>
+              <w:t>17th Panchaati</w:t>
+            </w:r>
           </w:p>
         </w:tc>
         <w:tc>
@@ -27441,7 +26865,6 @@
         </w:rPr>
         <w:br w:type="page"/>
       </w:r>
-      <w:proofErr w:type="spellStart"/>
       <w:r>
         <w:rPr>
           <w:b/>
@@ -27451,18 +26874,7 @@
           <w:u w:val="single"/>
         </w:rPr>
         <w:lastRenderedPageBreak/>
-        <w:t>TaittirIya</w:t>
-      </w:r>
-      <w:proofErr w:type="spellEnd"/>
-      <w:r>
-        <w:rPr>
-          <w:b/>
-          <w:bCs/>
-          <w:sz w:val="32"/>
-          <w:szCs w:val="32"/>
-          <w:u w:val="single"/>
-        </w:rPr>
-        <w:t xml:space="preserve"> Samhita – TS 4 Tamil </w:t>
+        <w:t xml:space="preserve">TaittirIya Samhita – TS 4 Tamil </w:t>
       </w:r>
       <w:r>
         <w:rPr>
@@ -31397,7 +30809,6 @@
         </w:rPr>
         <w:br w:type="page"/>
       </w:r>
-      <w:proofErr w:type="spellStart"/>
       <w:r>
         <w:rPr>
           <w:b/>
@@ -31407,18 +30818,7 @@
           <w:u w:val="single"/>
         </w:rPr>
         <w:lastRenderedPageBreak/>
-        <w:t>TaittirIya</w:t>
-      </w:r>
-      <w:proofErr w:type="spellEnd"/>
-      <w:r>
-        <w:rPr>
-          <w:b/>
-          <w:bCs/>
-          <w:sz w:val="32"/>
-          <w:szCs w:val="32"/>
-          <w:u w:val="single"/>
-        </w:rPr>
-        <w:t xml:space="preserve"> Samhita – TS </w:t>
+        <w:t xml:space="preserve">TaittirIya Samhita – TS </w:t>
       </w:r>
       <w:r>
         <w:rPr>
@@ -32979,19 +32379,8 @@
                 <w:sz w:val="28"/>
                 <w:szCs w:val="28"/>
               </w:rPr>
-              <w:t xml:space="preserve"> </w:t>
-            </w:r>
-            <w:proofErr w:type="spellStart"/>
-            <w:r>
-              <w:rPr>
-                <w:b/>
-                <w:bCs/>
-                <w:sz w:val="28"/>
-                <w:szCs w:val="28"/>
-              </w:rPr>
-              <w:t>Vaakyam</w:t>
-            </w:r>
-            <w:proofErr w:type="spellEnd"/>
+              <w:t xml:space="preserve"> Vaakyam</w:t>
+            </w:r>
           </w:p>
         </w:tc>
         <w:tc>
@@ -33185,19 +32574,8 @@
                 <w:sz w:val="28"/>
                 <w:szCs w:val="28"/>
               </w:rPr>
-              <w:t xml:space="preserve">4.4.4.6 </w:t>
-            </w:r>
-            <w:proofErr w:type="spellStart"/>
-            <w:r>
-              <w:rPr>
-                <w:b/>
-                <w:bCs/>
-                <w:sz w:val="28"/>
-                <w:szCs w:val="28"/>
-              </w:rPr>
-              <w:t>Vaakyam</w:t>
-            </w:r>
-            <w:proofErr w:type="spellEnd"/>
+              <w:t>4.4.4.6 Vaakyam</w:t>
+            </w:r>
           </w:p>
         </w:tc>
         <w:tc>
@@ -36165,7 +35543,7 @@
   <w:style w:type="paragraph" w:default="1" w:styleId="Normal">
     <w:name w:val="Normal"/>
     <w:qFormat/>
-    <w:rsid w:val="00F10937"/>
+    <w:rsid w:val="00EE5361"/>
     <w:pPr>
       <w:spacing w:before="120" w:line="276" w:lineRule="auto"/>
     </w:pPr>

</xml_diff>